<commit_message>
Documentatie: Concluzia + descrierea ultimelor modele
</commit_message>
<xml_diff>
--- a/Documentation/Raport.docx
+++ b/Documentation/Raport.docx
@@ -23980,29 +23980,1036 @@
       <w:pPr>
         <w:pStyle w:val="BodyText"/>
         <w:spacing w:line="338" w:lineRule="auto"/>
+        <w:ind w:left="153" w:right="151" w:firstLine="567"/>
+        <w:jc w:val="both"/>
+        <w:rPr>
+          <w:spacing w:val="-8"/>
+        </w:rPr>
+      </w:pPr>
+      <w:proofErr w:type="spellStart"/>
+      <w:r>
+        <w:rPr>
+          <w:spacing w:val="-8"/>
+        </w:rPr>
+        <w:t>Dintre</w:t>
+      </w:r>
+      <w:proofErr w:type="spellEnd"/>
+      <w:r>
+        <w:rPr>
+          <w:spacing w:val="-8"/>
+        </w:rPr>
+        <w:t xml:space="preserve"> </w:t>
+      </w:r>
+      <w:proofErr w:type="spellStart"/>
+      <w:r>
+        <w:rPr>
+          <w:spacing w:val="-8"/>
+        </w:rPr>
+        <w:t>toate</w:t>
+      </w:r>
+      <w:proofErr w:type="spellEnd"/>
+      <w:r>
+        <w:rPr>
+          <w:spacing w:val="-8"/>
+        </w:rPr>
+        <w:t xml:space="preserve"> </w:t>
+      </w:r>
+      <w:proofErr w:type="spellStart"/>
+      <w:r>
+        <w:rPr>
+          <w:spacing w:val="-8"/>
+        </w:rPr>
+        <w:t>modelele</w:t>
+      </w:r>
+      <w:proofErr w:type="spellEnd"/>
+      <w:r>
+        <w:rPr>
+          <w:spacing w:val="-8"/>
+        </w:rPr>
+        <w:t xml:space="preserve"> testate cel </w:t>
+      </w:r>
+      <w:proofErr w:type="spellStart"/>
+      <w:r>
+        <w:rPr>
+          <w:spacing w:val="-8"/>
+        </w:rPr>
+        <w:t>mai</w:t>
+      </w:r>
+      <w:proofErr w:type="spellEnd"/>
+      <w:r>
+        <w:rPr>
+          <w:spacing w:val="-8"/>
+        </w:rPr>
+        <w:t xml:space="preserve"> bun </w:t>
+      </w:r>
+      <w:proofErr w:type="spellStart"/>
+      <w:r>
+        <w:rPr>
+          <w:spacing w:val="-8"/>
+        </w:rPr>
+        <w:t>este</w:t>
+      </w:r>
+      <w:proofErr w:type="spellEnd"/>
+      <w:r>
+        <w:rPr>
+          <w:spacing w:val="-8"/>
+        </w:rPr>
+        <w:t xml:space="preserve"> variant ace </w:t>
+      </w:r>
+      <w:proofErr w:type="spellStart"/>
+      <w:r>
+        <w:rPr>
+          <w:spacing w:val="-8"/>
+        </w:rPr>
+        <w:t>foloseste</w:t>
+      </w:r>
+      <w:proofErr w:type="spellEnd"/>
+      <w:r>
+        <w:rPr>
+          <w:spacing w:val="-8"/>
+        </w:rPr>
+        <w:t xml:space="preserve"> Decision Tree pe un dataset </w:t>
+      </w:r>
+      <w:proofErr w:type="spellStart"/>
+      <w:r>
+        <w:rPr>
+          <w:spacing w:val="-8"/>
+        </w:rPr>
+        <w:t>preprocesat</w:t>
+      </w:r>
+      <w:proofErr w:type="spellEnd"/>
+      <w:r>
+        <w:rPr>
+          <w:spacing w:val="-8"/>
+        </w:rPr>
+        <w:t xml:space="preserve">, la </w:t>
+      </w:r>
+      <w:proofErr w:type="spellStart"/>
+      <w:r>
+        <w:rPr>
+          <w:spacing w:val="-8"/>
+        </w:rPr>
+        <w:t>acesta</w:t>
+      </w:r>
+      <w:proofErr w:type="spellEnd"/>
+      <w:r>
+        <w:rPr>
+          <w:spacing w:val="-8"/>
+        </w:rPr>
+        <w:t xml:space="preserve"> am </w:t>
+      </w:r>
+      <w:proofErr w:type="spellStart"/>
+      <w:r>
+        <w:rPr>
+          <w:spacing w:val="-8"/>
+        </w:rPr>
+        <w:t>obtinut</w:t>
+      </w:r>
+      <w:proofErr w:type="spellEnd"/>
+      <w:r>
+        <w:rPr>
+          <w:spacing w:val="-8"/>
+        </w:rPr>
+        <w:t xml:space="preserve"> o </w:t>
+      </w:r>
+      <w:proofErr w:type="spellStart"/>
+      <w:r>
+        <w:rPr>
+          <w:spacing w:val="-8"/>
+        </w:rPr>
+        <w:t>acuratete</w:t>
+      </w:r>
+      <w:proofErr w:type="spellEnd"/>
+      <w:r>
+        <w:rPr>
+          <w:spacing w:val="-8"/>
+        </w:rPr>
+        <w:t xml:space="preserve"> de 75</w:t>
+      </w:r>
+      <w:proofErr w:type="gramStart"/>
+      <w:r>
+        <w:rPr>
+          <w:spacing w:val="-8"/>
+        </w:rPr>
+        <w:t>%,  al</w:t>
+      </w:r>
+      <w:proofErr w:type="gramEnd"/>
+      <w:r>
+        <w:rPr>
+          <w:spacing w:val="-8"/>
+        </w:rPr>
+        <w:t xml:space="preserve"> </w:t>
+      </w:r>
+      <w:proofErr w:type="spellStart"/>
+      <w:r>
+        <w:rPr>
+          <w:spacing w:val="-8"/>
+        </w:rPr>
+        <w:t>doilea</w:t>
+      </w:r>
+      <w:proofErr w:type="spellEnd"/>
+      <w:r>
+        <w:rPr>
+          <w:spacing w:val="-8"/>
+        </w:rPr>
+        <w:t xml:space="preserve"> cel </w:t>
+      </w:r>
+      <w:proofErr w:type="spellStart"/>
+      <w:r>
+        <w:rPr>
+          <w:spacing w:val="-8"/>
+        </w:rPr>
+        <w:t>muai</w:t>
+      </w:r>
+      <w:proofErr w:type="spellEnd"/>
+      <w:r>
+        <w:rPr>
+          <w:spacing w:val="-8"/>
+        </w:rPr>
+        <w:t xml:space="preserve"> bun model </w:t>
+      </w:r>
+      <w:proofErr w:type="spellStart"/>
+      <w:r>
+        <w:rPr>
+          <w:spacing w:val="-8"/>
+        </w:rPr>
+        <w:t>fiind</w:t>
+      </w:r>
+      <w:proofErr w:type="spellEnd"/>
+      <w:r>
+        <w:rPr>
+          <w:spacing w:val="-8"/>
+        </w:rPr>
+        <w:t xml:space="preserve"> cel cu </w:t>
+      </w:r>
+      <w:proofErr w:type="spellStart"/>
+      <w:r>
+        <w:rPr>
+          <w:spacing w:val="-8"/>
+        </w:rPr>
+        <w:t>Locistic</w:t>
+      </w:r>
+      <w:proofErr w:type="spellEnd"/>
+      <w:r>
+        <w:rPr>
+          <w:spacing w:val="-8"/>
+        </w:rPr>
+        <w:t xml:space="preserve"> Regression pe </w:t>
+      </w:r>
+      <w:proofErr w:type="spellStart"/>
+      <w:r>
+        <w:rPr>
+          <w:spacing w:val="-8"/>
+        </w:rPr>
+        <w:t>acelasi</w:t>
+      </w:r>
+      <w:proofErr w:type="spellEnd"/>
+      <w:r>
+        <w:rPr>
+          <w:spacing w:val="-8"/>
+        </w:rPr>
+        <w:t xml:space="preserve"> dataset, </w:t>
+      </w:r>
+      <w:proofErr w:type="spellStart"/>
+      <w:r>
+        <w:rPr>
+          <w:spacing w:val="-8"/>
+        </w:rPr>
+        <w:t>avand</w:t>
+      </w:r>
+      <w:proofErr w:type="spellEnd"/>
+      <w:r>
+        <w:rPr>
+          <w:spacing w:val="-8"/>
+        </w:rPr>
+        <w:t xml:space="preserve"> 68% </w:t>
+      </w:r>
+      <w:proofErr w:type="spellStart"/>
+      <w:r>
+        <w:rPr>
+          <w:spacing w:val="-8"/>
+        </w:rPr>
+        <w:t>acuratete</w:t>
+      </w:r>
+      <w:proofErr w:type="spellEnd"/>
+      <w:r>
+        <w:rPr>
+          <w:spacing w:val="-8"/>
+        </w:rPr>
+        <w:t xml:space="preserve">. </w:t>
+      </w:r>
+    </w:p>
+    <w:p>
+      <w:pPr>
+        <w:pStyle w:val="BodyText"/>
+        <w:spacing w:line="338" w:lineRule="auto"/>
+        <w:ind w:left="153" w:right="151" w:firstLine="567"/>
+        <w:jc w:val="both"/>
+        <w:rPr>
+          <w:spacing w:val="-8"/>
+        </w:rPr>
+      </w:pPr>
+      <w:proofErr w:type="spellStart"/>
+      <w:r>
+        <w:rPr>
+          <w:spacing w:val="-8"/>
+        </w:rPr>
+        <w:t>Pentru</w:t>
+      </w:r>
+      <w:proofErr w:type="spellEnd"/>
+      <w:r>
+        <w:rPr>
+          <w:spacing w:val="-8"/>
+        </w:rPr>
+        <w:t xml:space="preserve"> </w:t>
+      </w:r>
+      <w:proofErr w:type="spellStart"/>
+      <w:r>
+        <w:rPr>
+          <w:spacing w:val="-8"/>
+        </w:rPr>
+        <w:t>procesare</w:t>
+      </w:r>
+      <w:proofErr w:type="spellEnd"/>
+      <w:r>
+        <w:rPr>
+          <w:spacing w:val="-8"/>
+        </w:rPr>
+        <w:t xml:space="preserve"> am </w:t>
+      </w:r>
+      <w:proofErr w:type="spellStart"/>
+      <w:r>
+        <w:rPr>
+          <w:spacing w:val="-8"/>
+        </w:rPr>
+        <w:t>selectat</w:t>
+      </w:r>
+      <w:proofErr w:type="spellEnd"/>
+      <w:r>
+        <w:rPr>
+          <w:spacing w:val="-8"/>
+        </w:rPr>
+        <w:t xml:space="preserve"> </w:t>
+      </w:r>
+      <w:proofErr w:type="spellStart"/>
+      <w:r>
+        <w:rPr>
+          <w:spacing w:val="-8"/>
+        </w:rPr>
+        <w:t>toate</w:t>
+      </w:r>
+      <w:proofErr w:type="spellEnd"/>
+      <w:r>
+        <w:rPr>
+          <w:spacing w:val="-8"/>
+        </w:rPr>
+        <w:t xml:space="preserve"> </w:t>
+      </w:r>
+      <w:proofErr w:type="spellStart"/>
+      <w:r>
+        <w:rPr>
+          <w:spacing w:val="-8"/>
+        </w:rPr>
+        <w:t>analizele</w:t>
+      </w:r>
+      <w:proofErr w:type="spellEnd"/>
+      <w:r>
+        <w:rPr>
+          <w:spacing w:val="-8"/>
+        </w:rPr>
+        <w:t xml:space="preserve"> </w:t>
+      </w:r>
+      <w:proofErr w:type="spellStart"/>
+      <w:r>
+        <w:rPr>
+          <w:spacing w:val="-8"/>
+        </w:rPr>
+        <w:t>unui</w:t>
+      </w:r>
+      <w:proofErr w:type="spellEnd"/>
+      <w:r>
+        <w:rPr>
+          <w:spacing w:val="-8"/>
+        </w:rPr>
+        <w:t xml:space="preserve"> </w:t>
+      </w:r>
+      <w:proofErr w:type="spellStart"/>
+      <w:r>
+        <w:rPr>
+          <w:spacing w:val="-8"/>
+        </w:rPr>
+        <w:t>pacient</w:t>
+      </w:r>
+      <w:proofErr w:type="spellEnd"/>
+      <w:r>
+        <w:rPr>
+          <w:spacing w:val="-8"/>
+        </w:rPr>
+        <w:t xml:space="preserve"> </w:t>
+      </w:r>
+      <w:proofErr w:type="spellStart"/>
+      <w:r>
+        <w:rPr>
+          <w:spacing w:val="-8"/>
+        </w:rPr>
+        <w:t>sa</w:t>
+      </w:r>
+      <w:proofErr w:type="spellEnd"/>
+      <w:r>
+        <w:rPr>
+          <w:spacing w:val="-8"/>
+        </w:rPr>
+        <w:t xml:space="preserve"> se </w:t>
+      </w:r>
+      <w:proofErr w:type="spellStart"/>
+      <w:r>
+        <w:rPr>
+          <w:spacing w:val="-8"/>
+        </w:rPr>
+        <w:t>afle</w:t>
+      </w:r>
+      <w:proofErr w:type="spellEnd"/>
+      <w:r>
+        <w:rPr>
+          <w:spacing w:val="-8"/>
+        </w:rPr>
+        <w:t xml:space="preserve"> pe o </w:t>
+      </w:r>
+      <w:proofErr w:type="spellStart"/>
+      <w:r>
+        <w:rPr>
+          <w:spacing w:val="-8"/>
+        </w:rPr>
+        <w:t>singura</w:t>
+      </w:r>
+      <w:proofErr w:type="spellEnd"/>
+      <w:r>
+        <w:rPr>
+          <w:spacing w:val="-8"/>
+        </w:rPr>
+        <w:t xml:space="preserve"> </w:t>
+      </w:r>
+      <w:proofErr w:type="spellStart"/>
+      <w:r>
+        <w:rPr>
+          <w:spacing w:val="-8"/>
+        </w:rPr>
+        <w:t>linie</w:t>
+      </w:r>
+      <w:proofErr w:type="spellEnd"/>
+      <w:r>
+        <w:rPr>
+          <w:spacing w:val="-8"/>
+        </w:rPr>
+        <w:t xml:space="preserve"> </w:t>
+      </w:r>
+      <w:proofErr w:type="spellStart"/>
+      <w:r>
+        <w:rPr>
+          <w:spacing w:val="-8"/>
+        </w:rPr>
+        <w:t>si</w:t>
+      </w:r>
+      <w:proofErr w:type="spellEnd"/>
+      <w:r>
+        <w:rPr>
+          <w:spacing w:val="-8"/>
+        </w:rPr>
+        <w:t xml:space="preserve"> am </w:t>
+      </w:r>
+      <w:proofErr w:type="spellStart"/>
+      <w:r>
+        <w:rPr>
+          <w:spacing w:val="-8"/>
+        </w:rPr>
+        <w:t>selectat</w:t>
+      </w:r>
+      <w:proofErr w:type="spellEnd"/>
+      <w:r>
+        <w:rPr>
+          <w:spacing w:val="-8"/>
+        </w:rPr>
+        <w:t xml:space="preserve"> </w:t>
+      </w:r>
+      <w:proofErr w:type="spellStart"/>
+      <w:r>
+        <w:rPr>
+          <w:spacing w:val="-8"/>
+        </w:rPr>
+        <w:t>doar</w:t>
+      </w:r>
+      <w:proofErr w:type="spellEnd"/>
+      <w:r>
+        <w:rPr>
+          <w:spacing w:val="-8"/>
+        </w:rPr>
+        <w:t xml:space="preserve"> </w:t>
+      </w:r>
+      <w:proofErr w:type="spellStart"/>
+      <w:r>
+        <w:rPr>
+          <w:spacing w:val="-8"/>
+        </w:rPr>
+        <w:t>parametrii</w:t>
+      </w:r>
+      <w:proofErr w:type="spellEnd"/>
+      <w:r>
+        <w:rPr>
+          <w:spacing w:val="-8"/>
+        </w:rPr>
+        <w:t xml:space="preserve"> </w:t>
+      </w:r>
+      <w:proofErr w:type="spellStart"/>
+      <w:r>
+        <w:rPr>
+          <w:spacing w:val="-8"/>
+        </w:rPr>
+        <w:t>ce</w:t>
+      </w:r>
+      <w:proofErr w:type="spellEnd"/>
+      <w:r>
+        <w:rPr>
+          <w:spacing w:val="-8"/>
+        </w:rPr>
+        <w:t xml:space="preserve"> au maxim 75% </w:t>
+      </w:r>
+      <w:proofErr w:type="spellStart"/>
+      <w:r>
+        <w:rPr>
+          <w:spacing w:val="-8"/>
+        </w:rPr>
+        <w:t>valori</w:t>
+      </w:r>
+      <w:proofErr w:type="spellEnd"/>
+      <w:r>
+        <w:rPr>
+          <w:spacing w:val="-8"/>
+        </w:rPr>
+        <w:t xml:space="preserve"> </w:t>
+      </w:r>
+      <w:proofErr w:type="spellStart"/>
+      <w:r>
+        <w:rPr>
+          <w:spacing w:val="-8"/>
+        </w:rPr>
+        <w:t>nule</w:t>
+      </w:r>
+      <w:proofErr w:type="spellEnd"/>
+      <w:r>
+        <w:rPr>
+          <w:spacing w:val="-8"/>
+        </w:rPr>
+        <w:t xml:space="preserve"> din </w:t>
+      </w:r>
+      <w:proofErr w:type="spellStart"/>
+      <w:r>
+        <w:rPr>
+          <w:spacing w:val="-8"/>
+        </w:rPr>
+        <w:t>numarul</w:t>
+      </w:r>
+      <w:proofErr w:type="spellEnd"/>
+      <w:r>
+        <w:rPr>
+          <w:spacing w:val="-8"/>
+        </w:rPr>
+        <w:t xml:space="preserve"> total. Am </w:t>
+      </w:r>
+      <w:proofErr w:type="spellStart"/>
+      <w:r>
+        <w:rPr>
+          <w:spacing w:val="-8"/>
+        </w:rPr>
+        <w:t>remarcat</w:t>
+      </w:r>
+      <w:proofErr w:type="spellEnd"/>
+      <w:r>
+        <w:rPr>
+          <w:spacing w:val="-8"/>
+        </w:rPr>
+        <w:t xml:space="preserve"> ca </w:t>
+      </w:r>
+      <w:proofErr w:type="spellStart"/>
+      <w:r>
+        <w:rPr>
+          <w:spacing w:val="-8"/>
+        </w:rPr>
+        <w:t>acesta</w:t>
+      </w:r>
+      <w:proofErr w:type="spellEnd"/>
+      <w:r>
+        <w:rPr>
+          <w:spacing w:val="-8"/>
+        </w:rPr>
+        <w:t xml:space="preserve"> </w:t>
+      </w:r>
+      <w:proofErr w:type="spellStart"/>
+      <w:r>
+        <w:rPr>
+          <w:spacing w:val="-8"/>
+        </w:rPr>
+        <w:t>este</w:t>
+      </w:r>
+      <w:proofErr w:type="spellEnd"/>
+      <w:r>
+        <w:rPr>
+          <w:spacing w:val="-8"/>
+        </w:rPr>
+        <w:t xml:space="preserve"> cel </w:t>
+      </w:r>
+      <w:proofErr w:type="spellStart"/>
+      <w:r>
+        <w:rPr>
+          <w:spacing w:val="-8"/>
+        </w:rPr>
+        <w:t>mai</w:t>
+      </w:r>
+      <w:proofErr w:type="spellEnd"/>
+      <w:r>
+        <w:rPr>
+          <w:spacing w:val="-8"/>
+        </w:rPr>
+        <w:t xml:space="preserve"> efficient </w:t>
+      </w:r>
+      <w:proofErr w:type="spellStart"/>
+      <w:r>
+        <w:rPr>
+          <w:spacing w:val="-8"/>
+        </w:rPr>
+        <w:t>dintre</w:t>
+      </w:r>
+      <w:proofErr w:type="spellEnd"/>
+      <w:r>
+        <w:rPr>
+          <w:spacing w:val="-8"/>
+        </w:rPr>
+        <w:t xml:space="preserve"> </w:t>
+      </w:r>
+      <w:proofErr w:type="spellStart"/>
+      <w:r>
+        <w:rPr>
+          <w:spacing w:val="-8"/>
+        </w:rPr>
+        <w:t>cele</w:t>
+      </w:r>
+      <w:proofErr w:type="spellEnd"/>
+      <w:r>
+        <w:rPr>
+          <w:spacing w:val="-8"/>
+        </w:rPr>
+        <w:t xml:space="preserve"> 3 </w:t>
+      </w:r>
+      <w:proofErr w:type="spellStart"/>
+      <w:r>
+        <w:rPr>
+          <w:spacing w:val="-8"/>
+        </w:rPr>
+        <w:t>variante</w:t>
+      </w:r>
+      <w:proofErr w:type="spellEnd"/>
+      <w:r>
+        <w:rPr>
+          <w:spacing w:val="-8"/>
+        </w:rPr>
+        <w:t xml:space="preserve"> </w:t>
+      </w:r>
+      <w:proofErr w:type="spellStart"/>
+      <w:r>
+        <w:rPr>
+          <w:spacing w:val="-8"/>
+        </w:rPr>
+        <w:t>incercate</w:t>
+      </w:r>
+      <w:proofErr w:type="spellEnd"/>
+      <w:r>
+        <w:rPr>
+          <w:spacing w:val="-8"/>
+        </w:rPr>
+        <w:t xml:space="preserve"> (25% NAN,</w:t>
+      </w:r>
+      <w:r>
+        <w:rPr>
+          <w:spacing w:val="-8"/>
+        </w:rPr>
+        <w:t xml:space="preserve"> 50% NAN, 75% NAN). </w:t>
+      </w:r>
+      <w:proofErr w:type="spellStart"/>
+      <w:r>
+        <w:rPr>
+          <w:spacing w:val="-8"/>
+        </w:rPr>
+        <w:t>Astfel</w:t>
+      </w:r>
+      <w:proofErr w:type="spellEnd"/>
+      <w:r>
+        <w:rPr>
+          <w:spacing w:val="-8"/>
+        </w:rPr>
+        <w:t xml:space="preserve"> am </w:t>
+      </w:r>
+      <w:proofErr w:type="spellStart"/>
+      <w:r>
+        <w:rPr>
+          <w:spacing w:val="-8"/>
+        </w:rPr>
+        <w:t>ajuns</w:t>
+      </w:r>
+      <w:proofErr w:type="spellEnd"/>
+      <w:r>
+        <w:rPr>
+          <w:spacing w:val="-8"/>
+        </w:rPr>
+        <w:t xml:space="preserve"> la un dataset cu 363 de </w:t>
+      </w:r>
+      <w:proofErr w:type="spellStart"/>
+      <w:r>
+        <w:rPr>
+          <w:spacing w:val="-8"/>
+        </w:rPr>
+        <w:t>pacienti</w:t>
+      </w:r>
+      <w:proofErr w:type="spellEnd"/>
+      <w:r>
+        <w:rPr>
+          <w:spacing w:val="-8"/>
+        </w:rPr>
+        <w:t xml:space="preserve"> cu 389 de </w:t>
+      </w:r>
+      <w:proofErr w:type="spellStart"/>
+      <w:r>
+        <w:rPr>
+          <w:spacing w:val="-8"/>
+        </w:rPr>
+        <w:t>parametri</w:t>
+      </w:r>
+      <w:proofErr w:type="spellEnd"/>
+      <w:r>
+        <w:rPr>
+          <w:spacing w:val="-8"/>
+        </w:rPr>
+        <w:t xml:space="preserve">. </w:t>
+      </w:r>
+    </w:p>
+    <w:p>
+      <w:pPr>
+        <w:pStyle w:val="BodyText"/>
+        <w:spacing w:line="338" w:lineRule="auto"/>
+        <w:ind w:left="153" w:right="151" w:firstLine="567"/>
+        <w:jc w:val="both"/>
+        <w:rPr>
+          <w:spacing w:val="-8"/>
+        </w:rPr>
+      </w:pPr>
+      <w:r>
+        <w:rPr>
+          <w:spacing w:val="-8"/>
+        </w:rPr>
+        <w:t xml:space="preserve"> </w:t>
+      </w:r>
+      <w:proofErr w:type="spellStart"/>
+      <w:r>
+        <w:rPr>
+          <w:spacing w:val="-8"/>
+        </w:rPr>
+        <w:t>Aceasta</w:t>
+      </w:r>
+      <w:proofErr w:type="spellEnd"/>
+      <w:r>
+        <w:rPr>
+          <w:spacing w:val="-8"/>
+        </w:rPr>
+        <w:t xml:space="preserve"> </w:t>
+      </w:r>
+      <w:proofErr w:type="spellStart"/>
+      <w:r>
+        <w:rPr>
+          <w:spacing w:val="-8"/>
+        </w:rPr>
+        <w:t>abordare</w:t>
+      </w:r>
+      <w:proofErr w:type="spellEnd"/>
+      <w:r>
+        <w:rPr>
+          <w:spacing w:val="-8"/>
+        </w:rPr>
+        <w:t xml:space="preserve"> ne </w:t>
+      </w:r>
+      <w:proofErr w:type="spellStart"/>
+      <w:r>
+        <w:rPr>
+          <w:spacing w:val="-8"/>
+        </w:rPr>
+        <w:t>permite</w:t>
+      </w:r>
+      <w:proofErr w:type="spellEnd"/>
+      <w:r>
+        <w:rPr>
+          <w:spacing w:val="-8"/>
+        </w:rPr>
+        <w:t xml:space="preserve"> </w:t>
+      </w:r>
+      <w:proofErr w:type="spellStart"/>
+      <w:r>
+        <w:rPr>
+          <w:spacing w:val="-8"/>
+        </w:rPr>
+        <w:t>sa</w:t>
+      </w:r>
+      <w:proofErr w:type="spellEnd"/>
+      <w:r>
+        <w:rPr>
+          <w:spacing w:val="-8"/>
+        </w:rPr>
+        <w:t xml:space="preserve"> </w:t>
+      </w:r>
+      <w:proofErr w:type="spellStart"/>
+      <w:r>
+        <w:rPr>
+          <w:spacing w:val="-8"/>
+        </w:rPr>
+        <w:t>ignoram</w:t>
+      </w:r>
+      <w:proofErr w:type="spellEnd"/>
+      <w:r>
+        <w:rPr>
+          <w:spacing w:val="-8"/>
+        </w:rPr>
+        <w:t xml:space="preserve"> </w:t>
+      </w:r>
+      <w:proofErr w:type="spellStart"/>
+      <w:r>
+        <w:rPr>
+          <w:spacing w:val="-8"/>
+        </w:rPr>
+        <w:t>parametrii</w:t>
+      </w:r>
+      <w:proofErr w:type="spellEnd"/>
+      <w:r>
+        <w:rPr>
+          <w:spacing w:val="-8"/>
+        </w:rPr>
+        <w:t xml:space="preserve"> care nu </w:t>
+      </w:r>
+      <w:proofErr w:type="spellStart"/>
+      <w:r>
+        <w:rPr>
+          <w:spacing w:val="-8"/>
+        </w:rPr>
+        <w:t>influenteaza</w:t>
+      </w:r>
+      <w:proofErr w:type="spellEnd"/>
+      <w:r>
+        <w:rPr>
+          <w:spacing w:val="-8"/>
+        </w:rPr>
+        <w:t xml:space="preserve"> </w:t>
+      </w:r>
+      <w:proofErr w:type="spellStart"/>
+      <w:r>
+        <w:rPr>
+          <w:spacing w:val="-8"/>
+        </w:rPr>
+        <w:t>rezultatul</w:t>
+      </w:r>
+      <w:proofErr w:type="spellEnd"/>
+      <w:r>
+        <w:rPr>
+          <w:spacing w:val="-8"/>
+        </w:rPr>
+        <w:t xml:space="preserve"> (</w:t>
+      </w:r>
+      <w:proofErr w:type="spellStart"/>
+      <w:r>
+        <w:rPr>
+          <w:spacing w:val="-8"/>
+        </w:rPr>
+        <w:t>vaccine_response</w:t>
+      </w:r>
+      <w:proofErr w:type="spellEnd"/>
+      <w:r>
+        <w:rPr>
+          <w:spacing w:val="-8"/>
+        </w:rPr>
+        <w:t xml:space="preserve">) </w:t>
+      </w:r>
+      <w:proofErr w:type="spellStart"/>
+      <w:r>
+        <w:rPr>
+          <w:spacing w:val="-8"/>
+        </w:rPr>
+        <w:t>si</w:t>
+      </w:r>
+      <w:proofErr w:type="spellEnd"/>
+      <w:r>
+        <w:rPr>
+          <w:spacing w:val="-8"/>
+        </w:rPr>
+        <w:t xml:space="preserve"> </w:t>
+      </w:r>
+      <w:proofErr w:type="spellStart"/>
+      <w:r>
+        <w:rPr>
+          <w:spacing w:val="-8"/>
+        </w:rPr>
+        <w:t>sa</w:t>
+      </w:r>
+      <w:proofErr w:type="spellEnd"/>
+      <w:r>
+        <w:rPr>
+          <w:spacing w:val="-8"/>
+        </w:rPr>
+        <w:t xml:space="preserve"> ne </w:t>
+      </w:r>
+      <w:proofErr w:type="spellStart"/>
+      <w:r>
+        <w:rPr>
+          <w:spacing w:val="-8"/>
+        </w:rPr>
+        <w:t>folosim</w:t>
+      </w:r>
+      <w:proofErr w:type="spellEnd"/>
+      <w:r>
+        <w:rPr>
+          <w:spacing w:val="-8"/>
+        </w:rPr>
+        <w:t xml:space="preserve"> efficient de </w:t>
+      </w:r>
+      <w:proofErr w:type="spellStart"/>
+      <w:r>
+        <w:rPr>
+          <w:spacing w:val="-8"/>
+        </w:rPr>
+        <w:t>datele</w:t>
+      </w:r>
+      <w:proofErr w:type="spellEnd"/>
+      <w:r>
+        <w:rPr>
+          <w:spacing w:val="-8"/>
+        </w:rPr>
+        <w:t xml:space="preserve"> </w:t>
+      </w:r>
+      <w:proofErr w:type="spellStart"/>
+      <w:r>
+        <w:rPr>
+          <w:spacing w:val="-8"/>
+        </w:rPr>
+        <w:t>relevante</w:t>
+      </w:r>
+      <w:proofErr w:type="spellEnd"/>
+      <w:r>
+        <w:rPr>
+          <w:spacing w:val="-8"/>
+        </w:rPr>
+        <w:t xml:space="preserve"> </w:t>
+      </w:r>
+      <w:proofErr w:type="spellStart"/>
+      <w:r>
+        <w:rPr>
+          <w:spacing w:val="-8"/>
+        </w:rPr>
+        <w:t>pentru</w:t>
+      </w:r>
+      <w:proofErr w:type="spellEnd"/>
+      <w:r>
+        <w:rPr>
+          <w:spacing w:val="-8"/>
+        </w:rPr>
+        <w:t xml:space="preserve"> a </w:t>
+      </w:r>
+      <w:proofErr w:type="spellStart"/>
+      <w:r>
+        <w:rPr>
+          <w:spacing w:val="-8"/>
+        </w:rPr>
+        <w:t>prezice</w:t>
+      </w:r>
+      <w:proofErr w:type="spellEnd"/>
+      <w:r>
+        <w:rPr>
+          <w:spacing w:val="-8"/>
+        </w:rPr>
+        <w:t xml:space="preserve"> cat </w:t>
+      </w:r>
+      <w:proofErr w:type="spellStart"/>
+      <w:r>
+        <w:rPr>
+          <w:spacing w:val="-8"/>
+        </w:rPr>
+        <w:t>mai</w:t>
+      </w:r>
+      <w:proofErr w:type="spellEnd"/>
+      <w:r>
+        <w:rPr>
+          <w:spacing w:val="-8"/>
+        </w:rPr>
+        <w:t xml:space="preserve"> precis un </w:t>
+      </w:r>
+      <w:proofErr w:type="spellStart"/>
+      <w:r>
+        <w:rPr>
+          <w:spacing w:val="-8"/>
+        </w:rPr>
+        <w:t>rezultat</w:t>
+      </w:r>
+      <w:proofErr w:type="spellEnd"/>
+      <w:r>
+        <w:rPr>
+          <w:spacing w:val="-8"/>
+        </w:rPr>
+        <w:t>.</w:t>
+      </w:r>
+    </w:p>
+    <w:p>
+      <w:pPr>
+        <w:pStyle w:val="BodyText"/>
+        <w:spacing w:line="338" w:lineRule="auto"/>
+        <w:ind w:left="153" w:right="151" w:firstLine="567"/>
+        <w:jc w:val="both"/>
+        <w:rPr>
+          <w:spacing w:val="-8"/>
+        </w:rPr>
+      </w:pPr>
+      <w:r>
+        <w:rPr>
+          <w:spacing w:val="-8"/>
+        </w:rPr>
+        <w:t xml:space="preserve">  </w:t>
+      </w:r>
+    </w:p>
+    <w:p>
+      <w:pPr>
+        <w:pStyle w:val="BodyText"/>
+        <w:spacing w:line="338" w:lineRule="auto"/>
         <w:ind w:left="153" w:right="151"/>
         <w:jc w:val="both"/>
-      </w:pPr>
-      <w:r>
-        <w:rPr>
+        <w:rPr>
+          <w:color w:val="FFFFFF" w:themeColor="background1"/>
+        </w:rPr>
+      </w:pPr>
+      <w:r>
+        <w:rPr>
+          <w:color w:val="FFFFFF" w:themeColor="background1"/>
           <w:spacing w:val="-8"/>
         </w:rPr>
         <w:t>Try</w:t>
       </w:r>
       <w:r>
         <w:rPr>
+          <w:color w:val="FFFFFF" w:themeColor="background1"/>
           <w:spacing w:val="-4"/>
         </w:rPr>
         <w:t xml:space="preserve"> </w:t>
       </w:r>
       <w:r>
         <w:rPr>
+          <w:color w:val="FFFFFF" w:themeColor="background1"/>
           <w:spacing w:val="-8"/>
         </w:rPr>
         <w:t>to</w:t>
       </w:r>
       <w:r>
         <w:rPr>
+          <w:color w:val="FFFFFF" w:themeColor="background1"/>
           <w:spacing w:val="-5"/>
         </w:rPr>
         <w:t xml:space="preserve"> </w:t>
@@ -24010,6 +25017,7 @@
       <w:proofErr w:type="spellStart"/>
       <w:r>
         <w:rPr>
+          <w:color w:val="FFFFFF" w:themeColor="background1"/>
           <w:spacing w:val="-8"/>
         </w:rPr>
         <w:t>emphasise</w:t>
@@ -24017,323 +25025,379 @@
       <w:proofErr w:type="spellEnd"/>
       <w:r>
         <w:rPr>
+          <w:color w:val="FFFFFF" w:themeColor="background1"/>
           <w:spacing w:val="-5"/>
         </w:rPr>
         <w:t xml:space="preserve"> </w:t>
       </w:r>
       <w:r>
         <w:rPr>
+          <w:color w:val="FFFFFF" w:themeColor="background1"/>
           <w:spacing w:val="-8"/>
         </w:rPr>
         <w:t>the</w:t>
       </w:r>
       <w:r>
         <w:rPr>
+          <w:color w:val="FFFFFF" w:themeColor="background1"/>
           <w:spacing w:val="-4"/>
         </w:rPr>
         <w:t xml:space="preserve"> </w:t>
       </w:r>
       <w:r>
         <w:rPr>
+          <w:color w:val="FFFFFF" w:themeColor="background1"/>
           <w:spacing w:val="-8"/>
         </w:rPr>
         <w:t>strengths</w:t>
       </w:r>
       <w:r>
         <w:rPr>
+          <w:color w:val="FFFFFF" w:themeColor="background1"/>
           <w:spacing w:val="-4"/>
         </w:rPr>
         <w:t xml:space="preserve"> </w:t>
       </w:r>
       <w:r>
         <w:rPr>
+          <w:color w:val="FFFFFF" w:themeColor="background1"/>
           <w:spacing w:val="-8"/>
         </w:rPr>
         <w:t>and</w:t>
       </w:r>
       <w:r>
         <w:rPr>
+          <w:color w:val="FFFFFF" w:themeColor="background1"/>
           <w:spacing w:val="-5"/>
         </w:rPr>
         <w:t xml:space="preserve"> </w:t>
       </w:r>
       <w:r>
         <w:rPr>
+          <w:color w:val="FFFFFF" w:themeColor="background1"/>
           <w:spacing w:val="-8"/>
         </w:rPr>
         <w:t>the</w:t>
       </w:r>
       <w:r>
         <w:rPr>
+          <w:color w:val="FFFFFF" w:themeColor="background1"/>
           <w:spacing w:val="-4"/>
         </w:rPr>
         <w:t xml:space="preserve"> </w:t>
       </w:r>
       <w:r>
         <w:rPr>
+          <w:color w:val="FFFFFF" w:themeColor="background1"/>
           <w:spacing w:val="-8"/>
         </w:rPr>
         <w:t>weaknesses</w:t>
       </w:r>
       <w:r>
         <w:rPr>
+          <w:color w:val="FFFFFF" w:themeColor="background1"/>
           <w:spacing w:val="-4"/>
         </w:rPr>
         <w:t xml:space="preserve"> </w:t>
       </w:r>
       <w:r>
         <w:rPr>
+          <w:color w:val="FFFFFF" w:themeColor="background1"/>
           <w:spacing w:val="-8"/>
         </w:rPr>
         <w:t>of</w:t>
       </w:r>
       <w:r>
         <w:rPr>
+          <w:color w:val="FFFFFF" w:themeColor="background1"/>
           <w:spacing w:val="-4"/>
         </w:rPr>
         <w:t xml:space="preserve"> </w:t>
       </w:r>
       <w:r>
         <w:rPr>
+          <w:color w:val="FFFFFF" w:themeColor="background1"/>
           <w:spacing w:val="-8"/>
         </w:rPr>
         <w:t>your</w:t>
       </w:r>
       <w:r>
         <w:rPr>
+          <w:color w:val="FFFFFF" w:themeColor="background1"/>
           <w:spacing w:val="-4"/>
         </w:rPr>
         <w:t xml:space="preserve"> </w:t>
       </w:r>
       <w:r>
         <w:rPr>
+          <w:color w:val="FFFFFF" w:themeColor="background1"/>
           <w:spacing w:val="-8"/>
         </w:rPr>
         <w:t>approach.</w:t>
       </w:r>
       <w:r>
         <w:rPr>
+          <w:color w:val="FFFFFF" w:themeColor="background1"/>
           <w:spacing w:val="35"/>
         </w:rPr>
         <w:t xml:space="preserve"> </w:t>
       </w:r>
       <w:r>
         <w:rPr>
+          <w:color w:val="FFFFFF" w:themeColor="background1"/>
           <w:spacing w:val="-8"/>
         </w:rPr>
         <w:t>What</w:t>
       </w:r>
       <w:r>
         <w:rPr>
+          <w:color w:val="FFFFFF" w:themeColor="background1"/>
           <w:spacing w:val="-5"/>
         </w:rPr>
         <w:t xml:space="preserve"> </w:t>
       </w:r>
       <w:r>
         <w:rPr>
+          <w:color w:val="FFFFFF" w:themeColor="background1"/>
           <w:spacing w:val="-8"/>
         </w:rPr>
         <w:t>are</w:t>
       </w:r>
       <w:r>
         <w:rPr>
+          <w:color w:val="FFFFFF" w:themeColor="background1"/>
           <w:spacing w:val="-4"/>
         </w:rPr>
         <w:t xml:space="preserve"> </w:t>
       </w:r>
       <w:r>
         <w:rPr>
+          <w:color w:val="FFFFFF" w:themeColor="background1"/>
           <w:spacing w:val="-8"/>
         </w:rPr>
         <w:t>the</w:t>
       </w:r>
       <w:r>
         <w:rPr>
+          <w:color w:val="FFFFFF" w:themeColor="background1"/>
           <w:spacing w:val="-4"/>
         </w:rPr>
         <w:t xml:space="preserve"> </w:t>
       </w:r>
       <w:r>
         <w:rPr>
+          <w:color w:val="FFFFFF" w:themeColor="background1"/>
           <w:spacing w:val="-8"/>
         </w:rPr>
         <w:t>major</w:t>
       </w:r>
       <w:r>
         <w:rPr>
+          <w:color w:val="FFFFFF" w:themeColor="background1"/>
           <w:spacing w:val="-5"/>
         </w:rPr>
         <w:t xml:space="preserve"> </w:t>
       </w:r>
       <w:r>
         <w:rPr>
+          <w:color w:val="FFFFFF" w:themeColor="background1"/>
           <w:spacing w:val="-8"/>
         </w:rPr>
         <w:t xml:space="preserve">shortcomings </w:t>
       </w:r>
       <w:r>
         <w:rPr>
+          <w:color w:val="FFFFFF" w:themeColor="background1"/>
           <w:spacing w:val="-2"/>
         </w:rPr>
         <w:t>of</w:t>
       </w:r>
       <w:r>
         <w:rPr>
+          <w:color w:val="FFFFFF" w:themeColor="background1"/>
           <w:spacing w:val="-14"/>
         </w:rPr>
         <w:t xml:space="preserve"> </w:t>
       </w:r>
       <w:r>
         <w:rPr>
+          <w:color w:val="FFFFFF" w:themeColor="background1"/>
           <w:spacing w:val="-2"/>
         </w:rPr>
         <w:t>your</w:t>
       </w:r>
       <w:r>
         <w:rPr>
+          <w:color w:val="FFFFFF" w:themeColor="background1"/>
           <w:spacing w:val="-14"/>
         </w:rPr>
         <w:t xml:space="preserve"> </w:t>
       </w:r>
       <w:r>
         <w:rPr>
+          <w:color w:val="FFFFFF" w:themeColor="background1"/>
           <w:spacing w:val="-2"/>
         </w:rPr>
         <w:t>current</w:t>
       </w:r>
       <w:r>
         <w:rPr>
+          <w:color w:val="FFFFFF" w:themeColor="background1"/>
           <w:spacing w:val="-13"/>
         </w:rPr>
         <w:t xml:space="preserve"> </w:t>
       </w:r>
       <w:r>
         <w:rPr>
+          <w:color w:val="FFFFFF" w:themeColor="background1"/>
           <w:spacing w:val="-2"/>
         </w:rPr>
         <w:t>method'!</w:t>
       </w:r>
       <w:r>
         <w:rPr>
+          <w:color w:val="FFFFFF" w:themeColor="background1"/>
           <w:spacing w:val="-10"/>
         </w:rPr>
         <w:t xml:space="preserve"> </w:t>
       </w:r>
       <w:r>
         <w:rPr>
+          <w:color w:val="FFFFFF" w:themeColor="background1"/>
           <w:spacing w:val="-2"/>
         </w:rPr>
         <w:t>For</w:t>
       </w:r>
       <w:r>
         <w:rPr>
+          <w:color w:val="FFFFFF" w:themeColor="background1"/>
           <w:spacing w:val="-14"/>
         </w:rPr>
         <w:t xml:space="preserve"> </w:t>
       </w:r>
       <w:r>
         <w:rPr>
+          <w:color w:val="FFFFFF" w:themeColor="background1"/>
           <w:spacing w:val="-2"/>
         </w:rPr>
         <w:t>each</w:t>
       </w:r>
       <w:r>
         <w:rPr>
+          <w:color w:val="FFFFFF" w:themeColor="background1"/>
           <w:spacing w:val="-14"/>
         </w:rPr>
         <w:t xml:space="preserve"> </w:t>
       </w:r>
       <w:r>
         <w:rPr>
+          <w:color w:val="FFFFFF" w:themeColor="background1"/>
           <w:spacing w:val="-2"/>
         </w:rPr>
         <w:t>shortcoming,</w:t>
       </w:r>
       <w:r>
         <w:rPr>
+          <w:color w:val="FFFFFF" w:themeColor="background1"/>
           <w:spacing w:val="-13"/>
         </w:rPr>
         <w:t xml:space="preserve"> </w:t>
       </w:r>
       <w:r>
         <w:rPr>
+          <w:color w:val="FFFFFF" w:themeColor="background1"/>
           <w:spacing w:val="-2"/>
         </w:rPr>
         <w:t>propose</w:t>
       </w:r>
       <w:r>
         <w:rPr>
+          <w:color w:val="FFFFFF" w:themeColor="background1"/>
           <w:spacing w:val="-14"/>
         </w:rPr>
         <w:t xml:space="preserve"> </w:t>
       </w:r>
       <w:r>
         <w:rPr>
+          <w:color w:val="FFFFFF" w:themeColor="background1"/>
           <w:spacing w:val="-2"/>
         </w:rPr>
         <w:t>additions</w:t>
       </w:r>
       <w:r>
         <w:rPr>
+          <w:color w:val="FFFFFF" w:themeColor="background1"/>
           <w:spacing w:val="-14"/>
         </w:rPr>
         <w:t xml:space="preserve"> </w:t>
       </w:r>
       <w:r>
         <w:rPr>
+          <w:color w:val="FFFFFF" w:themeColor="background1"/>
           <w:spacing w:val="-2"/>
         </w:rPr>
         <w:t>or</w:t>
       </w:r>
       <w:r>
         <w:rPr>
+          <w:color w:val="FFFFFF" w:themeColor="background1"/>
           <w:spacing w:val="-13"/>
         </w:rPr>
         <w:t xml:space="preserve"> </w:t>
       </w:r>
       <w:r>
         <w:rPr>
+          <w:color w:val="FFFFFF" w:themeColor="background1"/>
           <w:spacing w:val="-2"/>
         </w:rPr>
         <w:t>enhancements</w:t>
       </w:r>
       <w:r>
         <w:rPr>
+          <w:color w:val="FFFFFF" w:themeColor="background1"/>
           <w:spacing w:val="-14"/>
         </w:rPr>
         <w:t xml:space="preserve"> </w:t>
       </w:r>
       <w:r>
         <w:rPr>
+          <w:color w:val="FFFFFF" w:themeColor="background1"/>
           <w:spacing w:val="-2"/>
         </w:rPr>
         <w:t>that</w:t>
       </w:r>
       <w:r>
         <w:rPr>
+          <w:color w:val="FFFFFF" w:themeColor="background1"/>
           <w:spacing w:val="-13"/>
         </w:rPr>
         <w:t xml:space="preserve"> </w:t>
       </w:r>
       <w:r>
         <w:rPr>
+          <w:color w:val="FFFFFF" w:themeColor="background1"/>
           <w:spacing w:val="-2"/>
         </w:rPr>
         <w:t>would</w:t>
       </w:r>
       <w:r>
         <w:rPr>
+          <w:color w:val="FFFFFF" w:themeColor="background1"/>
           <w:spacing w:val="-14"/>
         </w:rPr>
         <w:t xml:space="preserve"> </w:t>
       </w:r>
       <w:r>
         <w:rPr>
+          <w:color w:val="FFFFFF" w:themeColor="background1"/>
           <w:spacing w:val="-2"/>
         </w:rPr>
         <w:t xml:space="preserve">help </w:t>
       </w:r>
       <w:r>
+        <w:rPr>
+          <w:color w:val="FFFFFF" w:themeColor="background1"/>
+        </w:rPr>
         <w:t>overcome it.</w:t>
       </w:r>
     </w:p>
@@ -24343,110 +25407,148 @@
         <w:spacing w:before="3"/>
         <w:ind w:left="492"/>
         <w:jc w:val="both"/>
-      </w:pPr>
-      <w:proofErr w:type="spellStart"/>
-      <w:r>
-        <w:rPr>
+        <w:rPr>
+          <w:color w:val="FFFFFF" w:themeColor="background1"/>
+        </w:rPr>
+      </w:pPr>
+      <w:proofErr w:type="spellStart"/>
+      <w:r>
+        <w:rPr>
+          <w:color w:val="FFFFFF" w:themeColor="background1"/>
           <w:spacing w:val="-6"/>
         </w:rPr>
         <w:t>Briefiy</w:t>
       </w:r>
       <w:proofErr w:type="spellEnd"/>
       <w:r>
-        <w:t xml:space="preserve"> </w:t>
-      </w:r>
-      <w:r>
-        <w:rPr>
+        <w:rPr>
+          <w:color w:val="FFFFFF" w:themeColor="background1"/>
+        </w:rPr>
+        <w:t xml:space="preserve"> </w:t>
+      </w:r>
+      <w:r>
+        <w:rPr>
+          <w:color w:val="FFFFFF" w:themeColor="background1"/>
           <w:spacing w:val="-6"/>
         </w:rPr>
         <w:t>summarize</w:t>
       </w:r>
       <w:r>
-        <w:t xml:space="preserve"> </w:t>
-      </w:r>
-      <w:r>
-        <w:rPr>
+        <w:rPr>
+          <w:color w:val="FFFFFF" w:themeColor="background1"/>
+        </w:rPr>
+        <w:t xml:space="preserve"> </w:t>
+      </w:r>
+      <w:r>
+        <w:rPr>
+          <w:color w:val="FFFFFF" w:themeColor="background1"/>
           <w:spacing w:val="-6"/>
         </w:rPr>
         <w:t>the</w:t>
       </w:r>
       <w:r>
         <w:rPr>
+          <w:color w:val="FFFFFF" w:themeColor="background1"/>
           <w:spacing w:val="1"/>
         </w:rPr>
         <w:t xml:space="preserve"> </w:t>
       </w:r>
       <w:r>
         <w:rPr>
+          <w:color w:val="FFFFFF" w:themeColor="background1"/>
           <w:spacing w:val="-6"/>
         </w:rPr>
         <w:t>important</w:t>
       </w:r>
       <w:r>
-        <w:t xml:space="preserve"> </w:t>
-      </w:r>
-      <w:r>
-        <w:rPr>
+        <w:rPr>
+          <w:color w:val="FFFFFF" w:themeColor="background1"/>
+        </w:rPr>
+        <w:t xml:space="preserve"> </w:t>
+      </w:r>
+      <w:r>
+        <w:rPr>
+          <w:color w:val="FFFFFF" w:themeColor="background1"/>
           <w:spacing w:val="-6"/>
         </w:rPr>
         <w:t>results</w:t>
       </w:r>
       <w:r>
-        <w:t xml:space="preserve"> </w:t>
-      </w:r>
-      <w:r>
-        <w:rPr>
+        <w:rPr>
+          <w:color w:val="FFFFFF" w:themeColor="background1"/>
+        </w:rPr>
+        <w:t xml:space="preserve"> </w:t>
+      </w:r>
+      <w:r>
+        <w:rPr>
+          <w:color w:val="FFFFFF" w:themeColor="background1"/>
           <w:spacing w:val="-6"/>
         </w:rPr>
         <w:t>and</w:t>
       </w:r>
       <w:r>
         <w:rPr>
+          <w:color w:val="FFFFFF" w:themeColor="background1"/>
           <w:spacing w:val="1"/>
         </w:rPr>
         <w:t xml:space="preserve"> </w:t>
       </w:r>
       <w:r>
         <w:rPr>
+          <w:color w:val="FFFFFF" w:themeColor="background1"/>
           <w:spacing w:val="-6"/>
         </w:rPr>
         <w:t>conclusions</w:t>
       </w:r>
       <w:r>
-        <w:t xml:space="preserve"> </w:t>
-      </w:r>
-      <w:r>
-        <w:rPr>
+        <w:rPr>
+          <w:color w:val="FFFFFF" w:themeColor="background1"/>
+        </w:rPr>
+        <w:t xml:space="preserve"> </w:t>
+      </w:r>
+      <w:r>
+        <w:rPr>
+          <w:color w:val="FFFFFF" w:themeColor="background1"/>
           <w:spacing w:val="-6"/>
         </w:rPr>
         <w:t>presented</w:t>
       </w:r>
       <w:r>
         <w:rPr>
+          <w:color w:val="FFFFFF" w:themeColor="background1"/>
           <w:spacing w:val="1"/>
         </w:rPr>
         <w:t xml:space="preserve"> </w:t>
       </w:r>
       <w:r>
         <w:rPr>
+          <w:color w:val="FFFFFF" w:themeColor="background1"/>
           <w:spacing w:val="-6"/>
         </w:rPr>
         <w:t>in</w:t>
       </w:r>
       <w:r>
-        <w:t xml:space="preserve"> </w:t>
-      </w:r>
-      <w:r>
-        <w:rPr>
+        <w:rPr>
+          <w:color w:val="FFFFFF" w:themeColor="background1"/>
+        </w:rPr>
+        <w:t xml:space="preserve"> </w:t>
+      </w:r>
+      <w:r>
+        <w:rPr>
+          <w:color w:val="FFFFFF" w:themeColor="background1"/>
           <w:spacing w:val="-6"/>
         </w:rPr>
         <w:t>the</w:t>
       </w:r>
       <w:r>
-        <w:t xml:space="preserve"> </w:t>
-      </w:r>
-      <w:r>
-        <w:rPr>
+        <w:rPr>
+          <w:color w:val="FFFFFF" w:themeColor="background1"/>
+        </w:rPr>
+        <w:t xml:space="preserve"> </w:t>
+      </w:r>
+      <w:r>
+        <w:rPr>
+          <w:color w:val="FFFFFF" w:themeColor="background1"/>
           <w:spacing w:val="-6"/>
         </w:rPr>
         <w:t>paper.</w:t>
@@ -24457,6 +25559,7 @@
         <w:pStyle w:val="BodyText"/>
         <w:spacing w:before="105"/>
         <w:rPr>
+          <w:color w:val="FFFFFF" w:themeColor="background1"/>
           <w:sz w:val="22"/>
         </w:rPr>
       </w:pPr>
@@ -24473,11 +25576,13 @@
         </w:tabs>
         <w:ind w:left="698" w:hanging="217"/>
         <w:rPr>
-          <w:sz w:val="25"/>
-        </w:rPr>
-      </w:pPr>
-      <w:r>
-        <w:rPr>
+          <w:color w:val="FFFFFF" w:themeColor="background1"/>
+          <w:sz w:val="25"/>
+        </w:rPr>
+      </w:pPr>
+      <w:r>
+        <w:rPr>
+          <w:color w:val="FFFFFF" w:themeColor="background1"/>
           <w:spacing w:val="-2"/>
           <w:sz w:val="25"/>
         </w:rPr>
@@ -24485,6 +25590,7 @@
       </w:r>
       <w:r>
         <w:rPr>
+          <w:color w:val="FFFFFF" w:themeColor="background1"/>
           <w:spacing w:val="-6"/>
           <w:sz w:val="25"/>
         </w:rPr>
@@ -24492,6 +25598,7 @@
       </w:r>
       <w:r>
         <w:rPr>
+          <w:color w:val="FFFFFF" w:themeColor="background1"/>
           <w:spacing w:val="-2"/>
           <w:sz w:val="25"/>
         </w:rPr>
@@ -24499,6 +25606,7 @@
       </w:r>
       <w:r>
         <w:rPr>
+          <w:color w:val="FFFFFF" w:themeColor="background1"/>
           <w:spacing w:val="-6"/>
           <w:sz w:val="25"/>
         </w:rPr>
@@ -24506,6 +25614,7 @@
       </w:r>
       <w:r>
         <w:rPr>
+          <w:color w:val="FFFFFF" w:themeColor="background1"/>
           <w:spacing w:val="-2"/>
           <w:sz w:val="25"/>
         </w:rPr>
@@ -24513,6 +25622,7 @@
       </w:r>
       <w:r>
         <w:rPr>
+          <w:color w:val="FFFFFF" w:themeColor="background1"/>
           <w:spacing w:val="-5"/>
           <w:sz w:val="25"/>
         </w:rPr>
@@ -24520,6 +25630,7 @@
       </w:r>
       <w:r>
         <w:rPr>
+          <w:color w:val="FFFFFF" w:themeColor="background1"/>
           <w:spacing w:val="-2"/>
           <w:sz w:val="25"/>
         </w:rPr>
@@ -24527,6 +25638,7 @@
       </w:r>
       <w:r>
         <w:rPr>
+          <w:color w:val="FFFFFF" w:themeColor="background1"/>
           <w:spacing w:val="-6"/>
           <w:sz w:val="25"/>
         </w:rPr>
@@ -24534,6 +25646,7 @@
       </w:r>
       <w:r>
         <w:rPr>
+          <w:color w:val="FFFFFF" w:themeColor="background1"/>
           <w:spacing w:val="-2"/>
           <w:sz w:val="25"/>
         </w:rPr>
@@ -24541,6 +25654,7 @@
       </w:r>
       <w:r>
         <w:rPr>
+          <w:color w:val="FFFFFF" w:themeColor="background1"/>
           <w:spacing w:val="-5"/>
           <w:sz w:val="25"/>
         </w:rPr>
@@ -24548,6 +25662,7 @@
       </w:r>
       <w:r>
         <w:rPr>
+          <w:color w:val="FFFFFF" w:themeColor="background1"/>
           <w:spacing w:val="-2"/>
           <w:sz w:val="25"/>
         </w:rPr>
@@ -24555,6 +25670,7 @@
       </w:r>
       <w:r>
         <w:rPr>
+          <w:color w:val="FFFFFF" w:themeColor="background1"/>
           <w:spacing w:val="-6"/>
           <w:sz w:val="25"/>
         </w:rPr>
@@ -24562,6 +25678,7 @@
       </w:r>
       <w:r>
         <w:rPr>
+          <w:color w:val="FFFFFF" w:themeColor="background1"/>
           <w:spacing w:val="-2"/>
           <w:sz w:val="25"/>
         </w:rPr>
@@ -24569,6 +25686,7 @@
       </w:r>
       <w:r>
         <w:rPr>
+          <w:color w:val="FFFFFF" w:themeColor="background1"/>
           <w:spacing w:val="-6"/>
           <w:sz w:val="25"/>
         </w:rPr>
@@ -24576,6 +25694,7 @@
       </w:r>
       <w:r>
         <w:rPr>
+          <w:color w:val="FFFFFF" w:themeColor="background1"/>
           <w:spacing w:val="-2"/>
           <w:sz w:val="25"/>
         </w:rPr>
@@ -24583,6 +25702,7 @@
       </w:r>
       <w:r>
         <w:rPr>
+          <w:color w:val="FFFFFF" w:themeColor="background1"/>
           <w:spacing w:val="-5"/>
           <w:sz w:val="25"/>
         </w:rPr>
@@ -24590,6 +25710,7 @@
       </w:r>
       <w:r>
         <w:rPr>
+          <w:color w:val="FFFFFF" w:themeColor="background1"/>
           <w:spacing w:val="-2"/>
           <w:sz w:val="25"/>
         </w:rPr>
@@ -24597,6 +25718,7 @@
       </w:r>
       <w:r>
         <w:rPr>
+          <w:color w:val="FFFFFF" w:themeColor="background1"/>
           <w:spacing w:val="-6"/>
           <w:sz w:val="25"/>
         </w:rPr>
@@ -24604,6 +25726,7 @@
       </w:r>
       <w:r>
         <w:rPr>
+          <w:color w:val="FFFFFF" w:themeColor="background1"/>
           <w:spacing w:val="-2"/>
           <w:sz w:val="25"/>
         </w:rPr>
@@ -24615,6 +25738,7 @@
         <w:pStyle w:val="BodyText"/>
         <w:spacing w:before="46"/>
         <w:rPr>
+          <w:color w:val="FFFFFF" w:themeColor="background1"/>
           <w:sz w:val="22"/>
         </w:rPr>
       </w:pPr>
@@ -24631,11 +25755,13 @@
         </w:tabs>
         <w:ind w:left="698" w:hanging="217"/>
         <w:rPr>
-          <w:sz w:val="25"/>
-        </w:rPr>
-      </w:pPr>
-      <w:r>
-        <w:rPr>
+          <w:color w:val="FFFFFF" w:themeColor="background1"/>
+          <w:sz w:val="25"/>
+        </w:rPr>
+      </w:pPr>
+      <w:r>
+        <w:rPr>
+          <w:color w:val="FFFFFF" w:themeColor="background1"/>
           <w:spacing w:val="-6"/>
           <w:sz w:val="25"/>
         </w:rPr>
@@ -24643,6 +25769,7 @@
       </w:r>
       <w:r>
         <w:rPr>
+          <w:color w:val="FFFFFF" w:themeColor="background1"/>
           <w:spacing w:val="-5"/>
           <w:sz w:val="25"/>
         </w:rPr>
@@ -24650,6 +25777,7 @@
       </w:r>
       <w:r>
         <w:rPr>
+          <w:color w:val="FFFFFF" w:themeColor="background1"/>
           <w:spacing w:val="-6"/>
           <w:sz w:val="25"/>
         </w:rPr>
@@ -24657,6 +25785,7 @@
       </w:r>
       <w:r>
         <w:rPr>
+          <w:color w:val="FFFFFF" w:themeColor="background1"/>
           <w:spacing w:val="-5"/>
           <w:sz w:val="25"/>
         </w:rPr>
@@ -24664,6 +25793,7 @@
       </w:r>
       <w:r>
         <w:rPr>
+          <w:color w:val="FFFFFF" w:themeColor="background1"/>
           <w:spacing w:val="-6"/>
           <w:sz w:val="25"/>
         </w:rPr>
@@ -24671,6 +25801,7 @@
       </w:r>
       <w:r>
         <w:rPr>
+          <w:color w:val="FFFFFF" w:themeColor="background1"/>
           <w:spacing w:val="-5"/>
           <w:sz w:val="25"/>
         </w:rPr>
@@ -24678,6 +25809,7 @@
       </w:r>
       <w:r>
         <w:rPr>
+          <w:color w:val="FFFFFF" w:themeColor="background1"/>
           <w:spacing w:val="-6"/>
           <w:sz w:val="25"/>
         </w:rPr>
@@ -24685,6 +25817,7 @@
       </w:r>
       <w:r>
         <w:rPr>
+          <w:color w:val="FFFFFF" w:themeColor="background1"/>
           <w:spacing w:val="-5"/>
           <w:sz w:val="25"/>
         </w:rPr>
@@ -24692,6 +25825,7 @@
       </w:r>
       <w:r>
         <w:rPr>
+          <w:color w:val="FFFFFF" w:themeColor="background1"/>
           <w:spacing w:val="-6"/>
           <w:sz w:val="25"/>
         </w:rPr>
@@ -24699,6 +25833,7 @@
       </w:r>
       <w:r>
         <w:rPr>
+          <w:color w:val="FFFFFF" w:themeColor="background1"/>
           <w:spacing w:val="-4"/>
           <w:sz w:val="25"/>
         </w:rPr>
@@ -24706,6 +25841,7 @@
       </w:r>
       <w:r>
         <w:rPr>
+          <w:color w:val="FFFFFF" w:themeColor="background1"/>
           <w:spacing w:val="-6"/>
           <w:sz w:val="25"/>
         </w:rPr>
@@ -24713,6 +25849,7 @@
       </w:r>
       <w:r>
         <w:rPr>
+          <w:color w:val="FFFFFF" w:themeColor="background1"/>
           <w:spacing w:val="-5"/>
           <w:sz w:val="25"/>
         </w:rPr>
@@ -24720,6 +25857,7 @@
       </w:r>
       <w:r>
         <w:rPr>
+          <w:color w:val="FFFFFF" w:themeColor="background1"/>
           <w:spacing w:val="-6"/>
           <w:sz w:val="25"/>
         </w:rPr>
@@ -24727,6 +25865,7 @@
       </w:r>
       <w:r>
         <w:rPr>
+          <w:color w:val="FFFFFF" w:themeColor="background1"/>
           <w:spacing w:val="-5"/>
           <w:sz w:val="25"/>
         </w:rPr>
@@ -24734,6 +25873,7 @@
       </w:r>
       <w:r>
         <w:rPr>
+          <w:color w:val="FFFFFF" w:themeColor="background1"/>
           <w:spacing w:val="-6"/>
           <w:sz w:val="25"/>
         </w:rPr>
@@ -24741,6 +25881,7 @@
       </w:r>
       <w:r>
         <w:rPr>
+          <w:color w:val="FFFFFF" w:themeColor="background1"/>
           <w:spacing w:val="-5"/>
           <w:sz w:val="25"/>
         </w:rPr>
@@ -24748,6 +25889,7 @@
       </w:r>
       <w:r>
         <w:rPr>
+          <w:color w:val="FFFFFF" w:themeColor="background1"/>
           <w:spacing w:val="-6"/>
           <w:sz w:val="25"/>
         </w:rPr>
@@ -24755,6 +25897,7 @@
       </w:r>
       <w:r>
         <w:rPr>
+          <w:color w:val="FFFFFF" w:themeColor="background1"/>
           <w:spacing w:val="-5"/>
           <w:sz w:val="25"/>
         </w:rPr>
@@ -24762,6 +25905,7 @@
       </w:r>
       <w:r>
         <w:rPr>
+          <w:color w:val="FFFFFF" w:themeColor="background1"/>
           <w:spacing w:val="-6"/>
           <w:sz w:val="25"/>
         </w:rPr>
@@ -24769,6 +25913,7 @@
       </w:r>
       <w:r>
         <w:rPr>
+          <w:color w:val="FFFFFF" w:themeColor="background1"/>
           <w:spacing w:val="-4"/>
           <w:sz w:val="25"/>
         </w:rPr>
@@ -24776,6 +25921,7 @@
       </w:r>
       <w:r>
         <w:rPr>
+          <w:color w:val="FFFFFF" w:themeColor="background1"/>
           <w:spacing w:val="-6"/>
           <w:sz w:val="25"/>
         </w:rPr>
@@ -24783,6 +25929,7 @@
       </w:r>
       <w:r>
         <w:rPr>
+          <w:color w:val="FFFFFF" w:themeColor="background1"/>
           <w:spacing w:val="-5"/>
           <w:sz w:val="25"/>
         </w:rPr>
@@ -24790,6 +25937,7 @@
       </w:r>
       <w:r>
         <w:rPr>
+          <w:color w:val="FFFFFF" w:themeColor="background1"/>
           <w:spacing w:val="-6"/>
           <w:sz w:val="25"/>
         </w:rPr>

</xml_diff>

<commit_message>
presentation and final fixes
</commit_message>
<xml_diff>
--- a/Documentation/Raport.docx
+++ b/Documentation/Raport.docx
@@ -1370,21 +1370,7 @@
                 <w:color w:val="FF0000"/>
                 <w:spacing w:val="-2"/>
               </w:rPr>
-              <w:t>Introduc</w:t>
-            </w:r>
-            <w:r>
-              <w:rPr>
-                <w:color w:val="FF0000"/>
-                <w:spacing w:val="-2"/>
-              </w:rPr>
-              <w:t>t</w:t>
-            </w:r>
-            <w:r>
-              <w:rPr>
-                <w:color w:val="FF0000"/>
-                <w:spacing w:val="-2"/>
-              </w:rPr>
-              <w:t>ion</w:t>
+              <w:t>Introduction</w:t>
             </w:r>
           </w:hyperlink>
           <w:r>
@@ -2129,19 +2115,7 @@
               <w:rPr>
                 <w:color w:val="FF0000"/>
               </w:rPr>
-              <w:t>Scienti</w:t>
-            </w:r>
-            <w:r>
-              <w:rPr>
-                <w:color w:val="FF0000"/>
-              </w:rPr>
-              <w:t>f</w:t>
-            </w:r>
-            <w:r>
-              <w:rPr>
-                <w:color w:val="FF0000"/>
-              </w:rPr>
-              <w:t>ic</w:t>
+              <w:t>Scientific</w:t>
             </w:r>
             <w:r>
               <w:rPr>
@@ -2155,35 +2129,7 @@
                 <w:color w:val="FF0000"/>
                 <w:spacing w:val="-2"/>
               </w:rPr>
-              <w:t>Pr</w:t>
-            </w:r>
-            <w:r>
-              <w:rPr>
-                <w:color w:val="FF0000"/>
-                <w:spacing w:val="-2"/>
-              </w:rPr>
-              <w:t>o</w:t>
-            </w:r>
-            <w:r>
-              <w:rPr>
-                <w:color w:val="FF0000"/>
-                <w:spacing w:val="-2"/>
-              </w:rPr>
-              <w:t>b</w:t>
-            </w:r>
-            <w:r>
-              <w:rPr>
-                <w:color w:val="FF0000"/>
-                <w:spacing w:val="-2"/>
-              </w:rPr>
-              <w:t>l</w:t>
-            </w:r>
-            <w:r>
-              <w:rPr>
-                <w:color w:val="FF0000"/>
-                <w:spacing w:val="-2"/>
-              </w:rPr>
-              <w:t>em</w:t>
+              <w:t>Problem</w:t>
             </w:r>
           </w:hyperlink>
           <w:r>
@@ -3554,31 +3500,7 @@
               <w:rPr>
                 <w:color w:val="FF0000"/>
               </w:rPr>
-              <w:t>Implem</w:t>
-            </w:r>
-            <w:r>
-              <w:rPr>
-                <w:color w:val="FF0000"/>
-              </w:rPr>
-              <w:t>e</w:t>
-            </w:r>
-            <w:r>
-              <w:rPr>
-                <w:color w:val="FF0000"/>
-              </w:rPr>
-              <w:t>nt</w:t>
-            </w:r>
-            <w:r>
-              <w:rPr>
-                <w:color w:val="FF0000"/>
-              </w:rPr>
-              <w:t>a</w:t>
-            </w:r>
-            <w:r>
-              <w:rPr>
-                <w:color w:val="FF0000"/>
-              </w:rPr>
-              <w:t>tion</w:t>
+              <w:t>Implementation</w:t>
             </w:r>
           </w:hyperlink>
           <w:r>
@@ -3980,14 +3902,7 @@
                 <w:color w:val="FF0000"/>
                 <w:spacing w:val="-4"/>
               </w:rPr>
-              <w:t>Testin</w:t>
-            </w:r>
-            <w:r>
-              <w:rPr>
-                <w:color w:val="FF0000"/>
-                <w:spacing w:val="-4"/>
-              </w:rPr>
-              <w:t>g</w:t>
+              <w:t>Testing</w:t>
             </w:r>
             <w:r>
               <w:rPr>
@@ -4015,21 +3930,7 @@
                 <w:color w:val="FF0000"/>
                 <w:spacing w:val="-4"/>
               </w:rPr>
-              <w:t>t</w:t>
-            </w:r>
-            <w:r>
-              <w:rPr>
-                <w:color w:val="FF0000"/>
-                <w:spacing w:val="-4"/>
-              </w:rPr>
-              <w:t>h</w:t>
-            </w:r>
-            <w:r>
-              <w:rPr>
-                <w:color w:val="FF0000"/>
-                <w:spacing w:val="-4"/>
-              </w:rPr>
-              <w:t>e</w:t>
+              <w:t>the</w:t>
             </w:r>
             <w:r>
               <w:rPr>
@@ -4410,19 +4311,7 @@
               <w:rPr>
                 <w:color w:val="FF0000"/>
               </w:rPr>
-              <w:t>v</w:t>
-            </w:r>
-            <w:r>
-              <w:rPr>
-                <w:color w:val="FF0000"/>
-              </w:rPr>
-              <w:t>a</w:t>
-            </w:r>
-            <w:r>
-              <w:rPr>
-                <w:color w:val="FF0000"/>
-              </w:rPr>
-              <w:t>lidation</w:t>
+              <w:t>validation</w:t>
             </w:r>
           </w:hyperlink>
           <w:r>
@@ -4796,37 +4685,7 @@
               <w:rPr>
                 <w:color w:val="FF0000"/>
               </w:rPr>
-              <w:t>Met</w:t>
-            </w:r>
-            <w:r>
-              <w:rPr>
-                <w:color w:val="FF0000"/>
-              </w:rPr>
-              <w:t>h</w:t>
-            </w:r>
-            <w:r>
-              <w:rPr>
-                <w:color w:val="FF0000"/>
-              </w:rPr>
-              <w:t>o</w:t>
-            </w:r>
-            <w:r>
-              <w:rPr>
-                <w:color w:val="FF0000"/>
-              </w:rPr>
-              <w:t>dol</w:t>
-            </w:r>
-            <w:r>
-              <w:rPr>
-                <w:color w:val="FF0000"/>
-              </w:rPr>
-              <w:t>o</w:t>
-            </w:r>
-            <w:r>
-              <w:rPr>
-                <w:color w:val="FF0000"/>
-              </w:rPr>
-              <w:t>gy</w:t>
+              <w:t>Methodology</w:t>
             </w:r>
           </w:hyperlink>
           <w:r>
@@ -5620,21 +5479,7 @@
                 <w:color w:val="FF0000"/>
                 <w:spacing w:val="-2"/>
               </w:rPr>
-              <w:t>Re</w:t>
-            </w:r>
-            <w:r>
-              <w:rPr>
-                <w:color w:val="FF0000"/>
-                <w:spacing w:val="-2"/>
-              </w:rPr>
-              <w:t>s</w:t>
-            </w:r>
-            <w:r>
-              <w:rPr>
-                <w:color w:val="FF0000"/>
-                <w:spacing w:val="-2"/>
-              </w:rPr>
-              <w:t>ults</w:t>
+              <w:t>Results</w:t>
             </w:r>
           </w:hyperlink>
           <w:r>
@@ -6456,13 +6301,7 @@
               <w:rPr>
                 <w:color w:val="FF0000"/>
               </w:rPr>
-              <w:t>futur</w:t>
-            </w:r>
-            <w:r>
-              <w:rPr>
-                <w:color w:val="FF0000"/>
-              </w:rPr>
-              <w:t>e</w:t>
+              <w:t>future</w:t>
             </w:r>
             <w:r>
               <w:rPr>
@@ -8177,31 +8016,7 @@
         <w:rPr>
           <w:spacing w:val="-4"/>
         </w:rPr>
-        <w:t>multidimensional analysis of the</w:t>
-      </w:r>
-      <w:r>
-        <w:rPr>
-          <w:spacing w:val="-4"/>
-        </w:rPr>
-        <w:t xml:space="preserve"> </w:t>
-      </w:r>
-      <w:r>
-        <w:rPr>
-          <w:spacing w:val="-4"/>
-        </w:rPr>
-        <w:t>influenza vaccine imprint on the</w:t>
-      </w:r>
-      <w:r>
-        <w:rPr>
-          <w:spacing w:val="-4"/>
-        </w:rPr>
-        <w:t xml:space="preserve"> </w:t>
-      </w:r>
-      <w:r>
-        <w:rPr>
-          <w:spacing w:val="-4"/>
-        </w:rPr>
-        <w:t>immune system</w:t>
+        <w:t>multidimensional analysis of the influenza vaccine imprint on the immune system</w:t>
       </w:r>
       <w:r>
         <w:rPr>
@@ -8278,19 +8093,7 @@
         <w:rPr>
           <w:spacing w:val="-4"/>
         </w:rPr>
-        <w:t>A robust and interpretable end-to-end deep learning</w:t>
-      </w:r>
-      <w:r>
-        <w:rPr>
-          <w:spacing w:val="-4"/>
-        </w:rPr>
-        <w:t xml:space="preserve"> by </w:t>
-      </w:r>
-      <w:r>
-        <w:rPr>
-          <w:spacing w:val="-4"/>
-        </w:rPr>
-        <w:t xml:space="preserve">Zicheng Hu, Alice Tang, Jaiveer Singh, Sanchita </w:t>
+        <w:t xml:space="preserve">A robust and interpretable end-to-end deep learning by Zicheng Hu, Alice Tang, Jaiveer Singh, Sanchita </w:t>
       </w:r>
       <w:proofErr w:type="spellStart"/>
       <w:r>
@@ -9033,19 +8836,7 @@
         <w:rPr>
           <w:spacing w:val="-7"/>
         </w:rPr>
-        <w:t xml:space="preserve">The application has a simple interface where you can enter first some general patient data, and </w:t>
-      </w:r>
-      <w:r>
-        <w:rPr>
-          <w:spacing w:val="-7"/>
-        </w:rPr>
-        <w:t>then</w:t>
-      </w:r>
-      <w:r>
-        <w:rPr>
-          <w:spacing w:val="-7"/>
-        </w:rPr>
-        <w:t xml:space="preserve"> you can upload a medical data file that can subtract the needed information to determine an output.</w:t>
+        <w:t>The application has a simple interface where you can enter first some general patient data, and then you can upload a medical data file that can subtract the needed information to determine an output.</w:t>
       </w:r>
     </w:p>
     <w:p>
@@ -9518,13 +9309,7 @@
       </w:r>
       <w:proofErr w:type="gramEnd"/>
       <w:r>
-        <w:t xml:space="preserve"> know exactly the expected output, and the results were all correct. For extended testing, in the future, we could collaborate with doctors to extract new data and alongside a doctor’s prediction, to see if our program gives </w:t>
-      </w:r>
-      <w:r>
-        <w:t>an</w:t>
-      </w:r>
-      <w:r>
-        <w:t xml:space="preserve"> identical result on multiple tests. </w:t>
+        <w:t xml:space="preserve"> know exactly the expected output, and the results were all correct. For extended testing, in the future, we could collaborate with doctors to extract new data and alongside a doctor’s prediction, to see if our program gives an identical result on multiple tests. </w:t>
       </w:r>
     </w:p>
     <w:p>
@@ -9622,31 +9407,7 @@
         <w:rPr>
           <w:spacing w:val="-6"/>
         </w:rPr>
-        <w:t xml:space="preserve"> we reached the</w:t>
-      </w:r>
-      <w:r>
-        <w:rPr>
-          <w:spacing w:val="-6"/>
-        </w:rPr>
-        <w:t xml:space="preserve"> </w:t>
-      </w:r>
-      <w:r>
-        <w:rPr>
-          <w:spacing w:val="-6"/>
-        </w:rPr>
-        <w:t>best</w:t>
-      </w:r>
-      <w:r>
-        <w:rPr>
-          <w:spacing w:val="-6"/>
-        </w:rPr>
-        <w:t xml:space="preserve"> </w:t>
-      </w:r>
-      <w:r>
-        <w:rPr>
-          <w:spacing w:val="-6"/>
-        </w:rPr>
-        <w:t>outcome.</w:t>
+        <w:t xml:space="preserve"> we reached the best outcome.</w:t>
       </w:r>
     </w:p>
     <w:p>
@@ -14187,117 +13948,80 @@
         <w:spacing w:before="220"/>
         <w:jc w:val="both"/>
         <w:rPr>
-          <w:rFonts w:ascii="Georgia"/>
-          <w:sz w:val="20"/>
-        </w:rPr>
-      </w:pPr>
-      <w:r>
-        <w:rPr>
-          <w:rFonts w:ascii="Georgia"/>
-          <w:sz w:val="20"/>
-        </w:rPr>
-        <w:t>Tomic, A., Tomic, I., Dekker, C.L.</w:t>
-      </w:r>
-      <w:r>
-        <w:rPr>
-          <w:rFonts w:ascii="Georgia"/>
-          <w:sz w:val="20"/>
-        </w:rPr>
-        <w:t> </w:t>
-      </w:r>
-      <w:r>
-        <w:rPr>
-          <w:rFonts w:ascii="Georgia"/>
+          <w:sz w:val="24"/>
+          <w:szCs w:val="24"/>
+        </w:rPr>
+      </w:pPr>
+      <w:r>
+        <w:rPr>
+          <w:sz w:val="24"/>
+          <w:szCs w:val="24"/>
+        </w:rPr>
+        <w:t>Tomic, A., Tomic, I., Dekker, C.L. </w:t>
+      </w:r>
+      <w:r>
+        <w:rPr>
           <w:i/>
           <w:iCs/>
-          <w:sz w:val="20"/>
+          <w:sz w:val="24"/>
+          <w:szCs w:val="24"/>
         </w:rPr>
         <w:t>et al.</w:t>
       </w:r>
       <w:r>
         <w:rPr>
-          <w:rFonts w:ascii="Georgia"/>
-          <w:sz w:val="20"/>
-        </w:rPr>
-        <w:t> </w:t>
-      </w:r>
-      <w:r>
-        <w:rPr>
-          <w:rFonts w:ascii="Georgia"/>
-          <w:sz w:val="20"/>
-        </w:rPr>
-        <w:t xml:space="preserve">The </w:t>
+          <w:sz w:val="24"/>
+          <w:szCs w:val="24"/>
+        </w:rPr>
+        <w:t xml:space="preserve"> The </w:t>
       </w:r>
       <w:proofErr w:type="spellStart"/>
       <w:r>
         <w:rPr>
-          <w:rFonts w:ascii="Georgia"/>
-          <w:sz w:val="20"/>
+          <w:sz w:val="24"/>
+          <w:szCs w:val="24"/>
         </w:rPr>
         <w:t>FluPRINT</w:t>
       </w:r>
       <w:proofErr w:type="spellEnd"/>
       <w:r>
         <w:rPr>
-          <w:rFonts w:ascii="Georgia"/>
-          <w:sz w:val="20"/>
-        </w:rPr>
-        <w:t xml:space="preserve"> dataset, a multidimensional analysis of the influenza vaccine imprint on the immune system.</w:t>
-      </w:r>
-      <w:r>
-        <w:rPr>
-          <w:rFonts w:ascii="Georgia"/>
-          <w:sz w:val="20"/>
-        </w:rPr>
-        <w:t> </w:t>
-      </w:r>
-      <w:r>
-        <w:rPr>
-          <w:rFonts w:ascii="Georgia"/>
+          <w:sz w:val="24"/>
+          <w:szCs w:val="24"/>
+        </w:rPr>
+        <w:t xml:space="preserve"> dataset, a multidimensional analysis of the influenza vaccine imprint on the immune system. </w:t>
+      </w:r>
+      <w:r>
+        <w:rPr>
           <w:i/>
           <w:iCs/>
-          <w:sz w:val="20"/>
+          <w:sz w:val="24"/>
+          <w:szCs w:val="24"/>
         </w:rPr>
         <w:t>Sci Data</w:t>
       </w:r>
       <w:r>
         <w:rPr>
-          <w:rFonts w:ascii="Georgia"/>
-          <w:sz w:val="20"/>
+          <w:sz w:val="24"/>
+          <w:szCs w:val="24"/>
         </w:rPr>
         <w:t> </w:t>
       </w:r>
       <w:r>
         <w:rPr>
-          <w:rFonts w:ascii="Georgia"/>
           <w:b/>
           <w:bCs/>
-          <w:sz w:val="20"/>
-        </w:rPr>
-        <w:t>6,</w:t>
-      </w:r>
-      <w:r>
-        <w:rPr>
-          <w:rFonts w:ascii="Georgia"/>
-          <w:b/>
-          <w:bCs/>
-          <w:sz w:val="20"/>
-        </w:rPr>
-        <w:t> </w:t>
-      </w:r>
-      <w:r>
-        <w:rPr>
-          <w:rFonts w:ascii="Georgia"/>
-          <w:sz w:val="20"/>
-        </w:rPr>
-        <w:t>214 (2019).</w:t>
-      </w:r>
-      <w:r>
-        <w:rPr>
-          <w:rFonts w:ascii="Georgia"/>
-          <w:sz w:val="20"/>
-        </w:rPr>
-        <w:t xml:space="preserve"> </w:t>
+          <w:sz w:val="24"/>
+          <w:szCs w:val="24"/>
+        </w:rPr>
+        <w:t>6, </w:t>
+      </w:r>
+      <w:r>
+        <w:rPr>
+          <w:sz w:val="24"/>
+          <w:szCs w:val="24"/>
+        </w:rPr>
+        <w:t xml:space="preserve">214 (2019). </w:t>
       </w:r>
     </w:p>
     <w:p>
@@ -14307,14 +14031,14 @@
         <w:ind w:firstLine="720"/>
         <w:jc w:val="both"/>
         <w:rPr>
-          <w:rFonts w:ascii="Georgia"/>
-          <w:sz w:val="20"/>
-        </w:rPr>
-      </w:pPr>
-      <w:r>
-        <w:rPr>
-          <w:rFonts w:ascii="Georgia"/>
-          <w:sz w:val="20"/>
+          <w:sz w:val="24"/>
+          <w:szCs w:val="24"/>
+        </w:rPr>
+      </w:pPr>
+      <w:r>
+        <w:rPr>
+          <w:sz w:val="24"/>
+          <w:szCs w:val="24"/>
         </w:rPr>
         <w:t xml:space="preserve">( </w:t>
       </w:r>
@@ -14322,16 +14046,16 @@
         <w:r>
           <w:rPr>
             <w:rStyle w:val="Hyperlink"/>
-            <w:rFonts w:ascii="Georgia"/>
-            <w:sz w:val="20"/>
+            <w:sz w:val="24"/>
+            <w:szCs w:val="24"/>
           </w:rPr>
           <w:t>https://zenodo.org/records/3222451</w:t>
         </w:r>
       </w:hyperlink>
       <w:r>
         <w:rPr>
-          <w:rFonts w:ascii="Georgia"/>
-          <w:sz w:val="20"/>
+          <w:sz w:val="24"/>
+          <w:szCs w:val="24"/>
         </w:rPr>
         <w:t xml:space="preserve"> )</w:t>
       </w:r>
@@ -14346,36 +14070,89 @@
         <w:spacing w:before="220"/>
         <w:jc w:val="both"/>
         <w:rPr>
-          <w:rFonts w:ascii="Georgia"/>
-          <w:sz w:val="20"/>
-        </w:rPr>
-      </w:pPr>
+          <w:color w:val="000000" w:themeColor="text1"/>
+          <w:sz w:val="24"/>
+          <w:szCs w:val="24"/>
+          <w:lang w:val="en-GB"/>
+        </w:rPr>
+      </w:pPr>
+      <w:r>
+        <w:rPr>
+          <w:color w:val="000000" w:themeColor="text1"/>
+          <w:sz w:val="24"/>
+          <w:szCs w:val="24"/>
+          <w:lang w:val="en-GB"/>
+        </w:rPr>
+        <w:t xml:space="preserve">The </w:t>
+      </w:r>
+      <w:proofErr w:type="spellStart"/>
+      <w:r>
+        <w:rPr>
+          <w:color w:val="000000" w:themeColor="text1"/>
+          <w:sz w:val="24"/>
+          <w:szCs w:val="24"/>
+          <w:lang w:val="en-GB"/>
+        </w:rPr>
+        <w:t>FluPRINT</w:t>
+      </w:r>
+      <w:proofErr w:type="spellEnd"/>
+      <w:r>
+        <w:rPr>
+          <w:color w:val="000000" w:themeColor="text1"/>
+          <w:sz w:val="24"/>
+          <w:szCs w:val="24"/>
+          <w:lang w:val="en-GB"/>
+        </w:rPr>
+        <w:t xml:space="preserve"> dataset, a multidimensional analysis of the influenza vaccine imprint on the immune system</w:t>
+      </w:r>
+      <w:r>
+        <w:rPr>
+          <w:color w:val="000000" w:themeColor="text1"/>
+          <w:sz w:val="24"/>
+          <w:szCs w:val="24"/>
+          <w:lang w:val="en-GB"/>
+        </w:rPr>
+        <w:t xml:space="preserve"> by </w:t>
+      </w:r>
       <w:hyperlink r:id="rId23" w:history="1">
         <w:r>
           <w:rPr>
             <w:rStyle w:val="Hyperlink"/>
-            <w:rFonts w:ascii="Georgia"/>
-            <w:sz w:val="20"/>
+            <w:color w:val="000000" w:themeColor="text1"/>
+            <w:sz w:val="24"/>
+            <w:szCs w:val="24"/>
+            <w:u w:val="none"/>
+            <w:lang w:val="en-GB"/>
           </w:rPr>
-          <w:t>https://doi.org/10.1038/s4159</w:t>
+          <w:t>Adriana Tomic</w:t>
         </w:r>
+      </w:hyperlink>
+      <w:r>
+        <w:rPr>
+          <w:color w:val="000000" w:themeColor="text1"/>
+          <w:sz w:val="24"/>
+          <w:szCs w:val="24"/>
+          <w:lang w:val="en-GB"/>
+        </w:rPr>
+        <w:t xml:space="preserve">: </w:t>
+      </w:r>
+      <w:hyperlink r:id="rId24" w:history="1">
         <w:r>
           <w:rPr>
             <w:rStyle w:val="Hyperlink"/>
-            <w:rFonts w:ascii="Georgia"/>
-            <w:sz w:val="20"/>
+            <w:sz w:val="24"/>
+            <w:szCs w:val="24"/>
           </w:rPr>
-          <w:t>7</w:t>
-        </w:r>
-        <w:r>
-          <w:rPr>
-            <w:rStyle w:val="Hyperlink"/>
-            <w:rFonts w:ascii="Georgia"/>
-            <w:sz w:val="20"/>
-          </w:rPr>
-          <w:t>-019-0213-4</w:t>
+          <w:t>https://doi.org/10.1038/s41597-019-0213-4</w:t>
         </w:r>
       </w:hyperlink>
+      <w:r>
+        <w:rPr>
+          <w:sz w:val="24"/>
+          <w:szCs w:val="24"/>
+        </w:rPr>
+        <w:t xml:space="preserve">   </w:t>
+      </w:r>
     </w:p>
     <w:p>
       <w:pPr>
@@ -14387,20 +14164,27 @@
         <w:spacing w:before="220"/>
         <w:jc w:val="both"/>
         <w:rPr>
-          <w:rFonts w:ascii="Georgia"/>
-          <w:sz w:val="20"/>
-        </w:rPr>
-      </w:pPr>
-      <w:hyperlink r:id="rId24" w:history="1">
+          <w:sz w:val="24"/>
+          <w:szCs w:val="24"/>
+        </w:rPr>
+      </w:pPr>
+      <w:hyperlink r:id="rId25" w:history="1">
         <w:r>
           <w:rPr>
             <w:rStyle w:val="Hyperlink"/>
-            <w:rFonts w:ascii="Georgia"/>
-            <w:sz w:val="20"/>
+            <w:sz w:val="24"/>
+            <w:szCs w:val="24"/>
           </w:rPr>
           <w:t>https://www.geeksforgeeks.org/</w:t>
         </w:r>
       </w:hyperlink>
+      <w:r>
+        <w:rPr>
+          <w:sz w:val="24"/>
+          <w:szCs w:val="24"/>
+        </w:rPr>
+        <w:t xml:space="preserve"> for dataset processing methods, and classification</w:t>
+      </w:r>
     </w:p>
     <w:p>
       <w:pPr>
@@ -14412,20 +14196,27 @@
         <w:spacing w:before="220"/>
         <w:jc w:val="both"/>
         <w:rPr>
-          <w:rFonts w:ascii="Georgia"/>
-          <w:sz w:val="20"/>
-        </w:rPr>
-      </w:pPr>
-      <w:hyperlink r:id="rId25" w:history="1">
+          <w:sz w:val="24"/>
+          <w:szCs w:val="24"/>
+        </w:rPr>
+      </w:pPr>
+      <w:hyperlink r:id="rId26" w:history="1">
         <w:r>
           <w:rPr>
             <w:rStyle w:val="Hyperlink"/>
-            <w:rFonts w:ascii="Georgia"/>
-            <w:sz w:val="20"/>
+            <w:sz w:val="24"/>
+            <w:szCs w:val="24"/>
           </w:rPr>
           <w:t>https://scikit-learn.org/</w:t>
         </w:r>
       </w:hyperlink>
+      <w:r>
+        <w:rPr>
+          <w:sz w:val="24"/>
+          <w:szCs w:val="24"/>
+        </w:rPr>
+        <w:t xml:space="preserve">  for the libraries needed for ai model</w:t>
+      </w:r>
     </w:p>
     <w:p>
       <w:pPr>
@@ -14437,155 +14228,65 @@
         <w:spacing w:before="220"/>
         <w:jc w:val="both"/>
         <w:rPr>
-          <w:rFonts w:ascii="Georgia"/>
-          <w:sz w:val="20"/>
-        </w:rPr>
-      </w:pPr>
-      <w:hyperlink r:id="rId26" w:history="1">
+          <w:sz w:val="24"/>
+          <w:szCs w:val="24"/>
+        </w:rPr>
+      </w:pPr>
+      <w:hyperlink r:id="rId27" w:history="1">
         <w:r>
           <w:rPr>
             <w:rStyle w:val="Hyperlink"/>
-            <w:rFonts w:ascii="Georgia"/>
-            <w:sz w:val="20"/>
+            <w:sz w:val="24"/>
+            <w:szCs w:val="24"/>
           </w:rPr>
           <w:t>https://github.com/</w:t>
         </w:r>
       </w:hyperlink>
-    </w:p>
-    <w:p>
-      <w:pPr>
-        <w:pStyle w:val="BodyText"/>
-        <w:numPr>
-          <w:ilvl w:val="0"/>
-          <w:numId w:val="10"/>
-        </w:numPr>
-        <w:spacing w:before="220"/>
-        <w:jc w:val="both"/>
-        <w:rPr>
-          <w:rFonts w:ascii="Georgia"/>
-          <w:sz w:val="20"/>
-        </w:rPr>
-      </w:pPr>
-      <w:hyperlink r:id="rId27" w:history="1">
-        <w:r>
-          <w:rPr>
-            <w:rStyle w:val="Hyperlink"/>
-            <w:rFonts w:ascii="Georgia"/>
-            <w:sz w:val="20"/>
-          </w:rPr>
-          <w:t>https://medium.com/</w:t>
-        </w:r>
-      </w:hyperlink>
-    </w:p>
-    <w:p>
-      <w:pPr>
-        <w:pStyle w:val="BodyText"/>
-        <w:numPr>
-          <w:ilvl w:val="0"/>
-          <w:numId w:val="10"/>
-        </w:numPr>
-        <w:spacing w:before="220"/>
-        <w:jc w:val="both"/>
-        <w:rPr>
-          <w:rFonts w:ascii="Georgia"/>
-          <w:sz w:val="20"/>
-        </w:rPr>
-      </w:pPr>
+      <w:r>
+        <w:rPr>
+          <w:sz w:val="24"/>
+          <w:szCs w:val="24"/>
+        </w:rPr>
+        <w:t xml:space="preserve"> </w:t>
+      </w:r>
+      <w:r>
+        <w:rPr>
+          <w:sz w:val="24"/>
+          <w:szCs w:val="24"/>
+        </w:rPr>
+        <w:t xml:space="preserve">and </w:t>
+      </w:r>
       <w:hyperlink r:id="rId28" w:history="1">
         <w:r>
           <w:rPr>
             <w:rStyle w:val="Hyperlink"/>
-            <w:rFonts w:ascii="Georgia"/>
-            <w:sz w:val="20"/>
+            <w:sz w:val="24"/>
+            <w:szCs w:val="24"/>
           </w:rPr>
           <w:t>https://stackoverflow.com/</w:t>
         </w:r>
       </w:hyperlink>
-    </w:p>
-    <w:bookmarkStart w:id="28" w:name="_bookmark22"/>
-    <w:bookmarkEnd w:id="28"/>
-    <w:p>
-      <w:pPr>
-        <w:pStyle w:val="BodyText"/>
-        <w:numPr>
-          <w:ilvl w:val="0"/>
-          <w:numId w:val="10"/>
-        </w:numPr>
-        <w:spacing w:before="220"/>
-        <w:jc w:val="both"/>
-        <w:rPr>
-          <w:rFonts w:ascii="Georgia"/>
-          <w:sz w:val="20"/>
-        </w:rPr>
-      </w:pPr>
-      <w:r>
-        <w:rPr>
-          <w:rFonts w:ascii="Georgia"/>
-          <w:sz w:val="20"/>
-        </w:rPr>
-        <w:fldChar w:fldCharType="begin"/>
-      </w:r>
-      <w:r>
-        <w:rPr>
-          <w:rFonts w:ascii="Georgia"/>
-          <w:sz w:val="20"/>
-        </w:rPr>
-        <w:instrText>HYPERLINK "</w:instrText>
-      </w:r>
-      <w:r>
-        <w:rPr>
-          <w:rFonts w:ascii="Georgia"/>
-          <w:sz w:val="20"/>
-        </w:rPr>
-        <w:instrText>https://www.kaggle.com/</w:instrText>
-      </w:r>
-      <w:r>
-        <w:rPr>
-          <w:rFonts w:ascii="Georgia"/>
-          <w:sz w:val="20"/>
-        </w:rPr>
-        <w:instrText>"</w:instrText>
-      </w:r>
-      <w:r>
-        <w:rPr>
-          <w:rFonts w:ascii="Georgia"/>
-          <w:sz w:val="20"/>
-        </w:rPr>
-      </w:r>
-      <w:r>
-        <w:rPr>
-          <w:rFonts w:ascii="Georgia"/>
-          <w:sz w:val="20"/>
-        </w:rPr>
-        <w:fldChar w:fldCharType="separate"/>
-      </w:r>
-      <w:r>
-        <w:rPr>
-          <w:rStyle w:val="Hyperlink"/>
-          <w:rFonts w:ascii="Georgia"/>
-          <w:sz w:val="20"/>
-        </w:rPr>
-        <w:t>https://www.kaggle.com/</w:t>
-      </w:r>
-      <w:r>
-        <w:rPr>
-          <w:rFonts w:ascii="Georgia"/>
-          <w:sz w:val="20"/>
-        </w:rPr>
-        <w:fldChar w:fldCharType="end"/>
-      </w:r>
-    </w:p>
-    <w:p>
-      <w:pPr>
-        <w:pStyle w:val="BodyText"/>
-        <w:spacing w:before="220"/>
-        <w:ind w:left="720"/>
-        <w:jc w:val="both"/>
-        <w:rPr>
-          <w:rFonts w:ascii="Georgia"/>
-          <w:sz w:val="20"/>
-        </w:rPr>
-      </w:pPr>
+      <w:r>
+        <w:rPr>
+          <w:sz w:val="24"/>
+          <w:szCs w:val="24"/>
+        </w:rPr>
+        <w:t xml:space="preserve">  for </w:t>
+      </w:r>
+      <w:r>
+        <w:rPr>
+          <w:sz w:val="24"/>
+          <w:szCs w:val="24"/>
+        </w:rPr>
+        <w:t xml:space="preserve">user fixes and </w:t>
+      </w:r>
+      <w:r>
+        <w:rPr>
+          <w:sz w:val="24"/>
+          <w:szCs w:val="24"/>
+        </w:rPr>
+        <w:t>suggestions</w:t>
+      </w:r>
     </w:p>
     <w:sectPr>
       <w:footerReference w:type="default" r:id="rId29"/>
@@ -15567,6 +15268,155 @@
     </w:lvl>
   </w:abstractNum>
   <w:abstractNum w:abstractNumId="5" w15:restartNumberingAfterBreak="0">
+    <w:nsid w:val="219E515E"/>
+    <w:multiLevelType w:val="multilevel"/>
+    <w:tmpl w:val="9FA638CC"/>
+    <w:lvl w:ilvl="0">
+      <w:start w:val="1"/>
+      <w:numFmt w:val="bullet"/>
+      <w:lvlText w:val=""/>
+      <w:lvlJc w:val="left"/>
+      <w:pPr>
+        <w:tabs>
+          <w:tab w:val="num" w:pos="720"/>
+        </w:tabs>
+        <w:ind w:left="720" w:hanging="360"/>
+      </w:pPr>
+      <w:rPr>
+        <w:rFonts w:ascii="Symbol" w:hAnsi="Symbol" w:hint="default"/>
+        <w:sz w:val="20"/>
+      </w:rPr>
+    </w:lvl>
+    <w:lvl w:ilvl="1" w:tentative="1">
+      <w:start w:val="1"/>
+      <w:numFmt w:val="bullet"/>
+      <w:lvlText w:val="o"/>
+      <w:lvlJc w:val="left"/>
+      <w:pPr>
+        <w:tabs>
+          <w:tab w:val="num" w:pos="1440"/>
+        </w:tabs>
+        <w:ind w:left="1440" w:hanging="360"/>
+      </w:pPr>
+      <w:rPr>
+        <w:rFonts w:ascii="Courier New" w:hAnsi="Courier New" w:hint="default"/>
+        <w:sz w:val="20"/>
+      </w:rPr>
+    </w:lvl>
+    <w:lvl w:ilvl="2" w:tentative="1">
+      <w:start w:val="1"/>
+      <w:numFmt w:val="bullet"/>
+      <w:lvlText w:val=""/>
+      <w:lvlJc w:val="left"/>
+      <w:pPr>
+        <w:tabs>
+          <w:tab w:val="num" w:pos="2160"/>
+        </w:tabs>
+        <w:ind w:left="2160" w:hanging="360"/>
+      </w:pPr>
+      <w:rPr>
+        <w:rFonts w:ascii="Wingdings" w:hAnsi="Wingdings" w:hint="default"/>
+        <w:sz w:val="20"/>
+      </w:rPr>
+    </w:lvl>
+    <w:lvl w:ilvl="3" w:tentative="1">
+      <w:start w:val="1"/>
+      <w:numFmt w:val="bullet"/>
+      <w:lvlText w:val=""/>
+      <w:lvlJc w:val="left"/>
+      <w:pPr>
+        <w:tabs>
+          <w:tab w:val="num" w:pos="2880"/>
+        </w:tabs>
+        <w:ind w:left="2880" w:hanging="360"/>
+      </w:pPr>
+      <w:rPr>
+        <w:rFonts w:ascii="Wingdings" w:hAnsi="Wingdings" w:hint="default"/>
+        <w:sz w:val="20"/>
+      </w:rPr>
+    </w:lvl>
+    <w:lvl w:ilvl="4" w:tentative="1">
+      <w:start w:val="1"/>
+      <w:numFmt w:val="bullet"/>
+      <w:lvlText w:val=""/>
+      <w:lvlJc w:val="left"/>
+      <w:pPr>
+        <w:tabs>
+          <w:tab w:val="num" w:pos="3600"/>
+        </w:tabs>
+        <w:ind w:left="3600" w:hanging="360"/>
+      </w:pPr>
+      <w:rPr>
+        <w:rFonts w:ascii="Wingdings" w:hAnsi="Wingdings" w:hint="default"/>
+        <w:sz w:val="20"/>
+      </w:rPr>
+    </w:lvl>
+    <w:lvl w:ilvl="5" w:tentative="1">
+      <w:start w:val="1"/>
+      <w:numFmt w:val="bullet"/>
+      <w:lvlText w:val=""/>
+      <w:lvlJc w:val="left"/>
+      <w:pPr>
+        <w:tabs>
+          <w:tab w:val="num" w:pos="4320"/>
+        </w:tabs>
+        <w:ind w:left="4320" w:hanging="360"/>
+      </w:pPr>
+      <w:rPr>
+        <w:rFonts w:ascii="Wingdings" w:hAnsi="Wingdings" w:hint="default"/>
+        <w:sz w:val="20"/>
+      </w:rPr>
+    </w:lvl>
+    <w:lvl w:ilvl="6" w:tentative="1">
+      <w:start w:val="1"/>
+      <w:numFmt w:val="bullet"/>
+      <w:lvlText w:val=""/>
+      <w:lvlJc w:val="left"/>
+      <w:pPr>
+        <w:tabs>
+          <w:tab w:val="num" w:pos="5040"/>
+        </w:tabs>
+        <w:ind w:left="5040" w:hanging="360"/>
+      </w:pPr>
+      <w:rPr>
+        <w:rFonts w:ascii="Wingdings" w:hAnsi="Wingdings" w:hint="default"/>
+        <w:sz w:val="20"/>
+      </w:rPr>
+    </w:lvl>
+    <w:lvl w:ilvl="7" w:tentative="1">
+      <w:start w:val="1"/>
+      <w:numFmt w:val="bullet"/>
+      <w:lvlText w:val=""/>
+      <w:lvlJc w:val="left"/>
+      <w:pPr>
+        <w:tabs>
+          <w:tab w:val="num" w:pos="5760"/>
+        </w:tabs>
+        <w:ind w:left="5760" w:hanging="360"/>
+      </w:pPr>
+      <w:rPr>
+        <w:rFonts w:ascii="Wingdings" w:hAnsi="Wingdings" w:hint="default"/>
+        <w:sz w:val="20"/>
+      </w:rPr>
+    </w:lvl>
+    <w:lvl w:ilvl="8" w:tentative="1">
+      <w:start w:val="1"/>
+      <w:numFmt w:val="bullet"/>
+      <w:lvlText w:val=""/>
+      <w:lvlJc w:val="left"/>
+      <w:pPr>
+        <w:tabs>
+          <w:tab w:val="num" w:pos="6480"/>
+        </w:tabs>
+        <w:ind w:left="6480" w:hanging="360"/>
+      </w:pPr>
+      <w:rPr>
+        <w:rFonts w:ascii="Wingdings" w:hAnsi="Wingdings" w:hint="default"/>
+        <w:sz w:val="20"/>
+      </w:rPr>
+    </w:lvl>
+  </w:abstractNum>
+  <w:abstractNum w:abstractNumId="6" w15:restartNumberingAfterBreak="0">
     <w:nsid w:val="24725D5C"/>
     <w:multiLevelType w:val="hybridMultilevel"/>
     <w:tmpl w:val="BFBC3E68"/>
@@ -15679,7 +15529,7 @@
       </w:rPr>
     </w:lvl>
   </w:abstractNum>
-  <w:abstractNum w:abstractNumId="6" w15:restartNumberingAfterBreak="0">
+  <w:abstractNum w:abstractNumId="7" w15:restartNumberingAfterBreak="0">
     <w:nsid w:val="2ADF5B79"/>
     <w:multiLevelType w:val="hybridMultilevel"/>
     <w:tmpl w:val="CBD0761E"/>
@@ -15792,7 +15642,7 @@
       </w:rPr>
     </w:lvl>
   </w:abstractNum>
-  <w:abstractNum w:abstractNumId="7" w15:restartNumberingAfterBreak="0">
+  <w:abstractNum w:abstractNumId="8" w15:restartNumberingAfterBreak="0">
     <w:nsid w:val="31997FCD"/>
     <w:multiLevelType w:val="multilevel"/>
     <w:tmpl w:val="78BE91FC"/>
@@ -15915,7 +15765,7 @@
       </w:rPr>
     </w:lvl>
   </w:abstractNum>
-  <w:abstractNum w:abstractNumId="8" w15:restartNumberingAfterBreak="0">
+  <w:abstractNum w:abstractNumId="9" w15:restartNumberingAfterBreak="0">
     <w:nsid w:val="3D577A52"/>
     <w:multiLevelType w:val="hybridMultilevel"/>
     <w:tmpl w:val="B8D2CAD2"/>
@@ -16036,7 +15886,7 @@
       </w:rPr>
     </w:lvl>
   </w:abstractNum>
-  <w:abstractNum w:abstractNumId="9" w15:restartNumberingAfterBreak="0">
+  <w:abstractNum w:abstractNumId="10" w15:restartNumberingAfterBreak="0">
     <w:nsid w:val="464C121F"/>
     <w:multiLevelType w:val="multilevel"/>
     <w:tmpl w:val="E3BC6292"/>
@@ -16179,7 +16029,7 @@
       </w:rPr>
     </w:lvl>
   </w:abstractNum>
-  <w:abstractNum w:abstractNumId="10" w15:restartNumberingAfterBreak="0">
+  <w:abstractNum w:abstractNumId="11" w15:restartNumberingAfterBreak="0">
     <w:nsid w:val="563611DD"/>
     <w:multiLevelType w:val="multilevel"/>
     <w:tmpl w:val="7032C060"/>
@@ -16319,7 +16169,7 @@
       </w:rPr>
     </w:lvl>
   </w:abstractNum>
-  <w:abstractNum w:abstractNumId="11" w15:restartNumberingAfterBreak="0">
+  <w:abstractNum w:abstractNumId="12" w15:restartNumberingAfterBreak="0">
     <w:nsid w:val="57E23CB1"/>
     <w:multiLevelType w:val="hybridMultilevel"/>
     <w:tmpl w:val="39F82F4E"/>
@@ -16432,7 +16282,7 @@
       </w:rPr>
     </w:lvl>
   </w:abstractNum>
-  <w:abstractNum w:abstractNumId="12" w15:restartNumberingAfterBreak="0">
+  <w:abstractNum w:abstractNumId="13" w15:restartNumberingAfterBreak="0">
     <w:nsid w:val="5878391E"/>
     <w:multiLevelType w:val="multilevel"/>
     <w:tmpl w:val="7032C060"/>
@@ -16572,7 +16422,7 @@
       </w:rPr>
     </w:lvl>
   </w:abstractNum>
-  <w:abstractNum w:abstractNumId="13" w15:restartNumberingAfterBreak="0">
+  <w:abstractNum w:abstractNumId="14" w15:restartNumberingAfterBreak="0">
     <w:nsid w:val="5C1A1720"/>
     <w:multiLevelType w:val="hybridMultilevel"/>
     <w:tmpl w:val="994C7ECE"/>
@@ -16685,7 +16535,7 @@
       </w:rPr>
     </w:lvl>
   </w:abstractNum>
-  <w:abstractNum w:abstractNumId="14" w15:restartNumberingAfterBreak="0">
+  <w:abstractNum w:abstractNumId="15" w15:restartNumberingAfterBreak="0">
     <w:nsid w:val="5CCF347B"/>
     <w:multiLevelType w:val="hybridMultilevel"/>
     <w:tmpl w:val="2028E16E"/>
@@ -16798,7 +16648,7 @@
       </w:rPr>
     </w:lvl>
   </w:abstractNum>
-  <w:abstractNum w:abstractNumId="15" w15:restartNumberingAfterBreak="0">
+  <w:abstractNum w:abstractNumId="16" w15:restartNumberingAfterBreak="0">
     <w:nsid w:val="604913D6"/>
     <w:multiLevelType w:val="hybridMultilevel"/>
     <w:tmpl w:val="FDF2EFEC"/>
@@ -16911,7 +16761,7 @@
       </w:rPr>
     </w:lvl>
   </w:abstractNum>
-  <w:abstractNum w:abstractNumId="16" w15:restartNumberingAfterBreak="0">
+  <w:abstractNum w:abstractNumId="17" w15:restartNumberingAfterBreak="0">
     <w:nsid w:val="63A74B12"/>
     <w:multiLevelType w:val="multilevel"/>
     <w:tmpl w:val="7032C060"/>
@@ -17051,7 +16901,7 @@
       </w:rPr>
     </w:lvl>
   </w:abstractNum>
-  <w:abstractNum w:abstractNumId="17" w15:restartNumberingAfterBreak="0">
+  <w:abstractNum w:abstractNumId="18" w15:restartNumberingAfterBreak="0">
     <w:nsid w:val="67EA3A50"/>
     <w:multiLevelType w:val="hybridMultilevel"/>
     <w:tmpl w:val="87A0A928"/>
@@ -17137,7 +16987,7 @@
       </w:pPr>
     </w:lvl>
   </w:abstractNum>
-  <w:abstractNum w:abstractNumId="18" w15:restartNumberingAfterBreak="0">
+  <w:abstractNum w:abstractNumId="19" w15:restartNumberingAfterBreak="0">
     <w:nsid w:val="6CC928B7"/>
     <w:multiLevelType w:val="hybridMultilevel"/>
     <w:tmpl w:val="41720054"/>
@@ -17258,7 +17108,7 @@
       </w:rPr>
     </w:lvl>
   </w:abstractNum>
-  <w:abstractNum w:abstractNumId="19" w15:restartNumberingAfterBreak="0">
+  <w:abstractNum w:abstractNumId="20" w15:restartNumberingAfterBreak="0">
     <w:nsid w:val="6D5950CD"/>
     <w:multiLevelType w:val="hybridMultilevel"/>
     <w:tmpl w:val="0660FA72"/>
@@ -17371,10 +17221,10 @@
       </w:rPr>
     </w:lvl>
   </w:abstractNum>
-  <w:abstractNum w:abstractNumId="20" w15:restartNumberingAfterBreak="0">
+  <w:abstractNum w:abstractNumId="21" w15:restartNumberingAfterBreak="0">
     <w:nsid w:val="724F224B"/>
     <w:multiLevelType w:val="hybridMultilevel"/>
-    <w:tmpl w:val="BE96FD10"/>
+    <w:tmpl w:val="1F1493F0"/>
     <w:lvl w:ilvl="0" w:tplc="08090001">
       <w:start w:val="1"/>
       <w:numFmt w:val="bullet"/>
@@ -17484,7 +17334,7 @@
       </w:rPr>
     </w:lvl>
   </w:abstractNum>
-  <w:abstractNum w:abstractNumId="21" w15:restartNumberingAfterBreak="0">
+  <w:abstractNum w:abstractNumId="22" w15:restartNumberingAfterBreak="0">
     <w:nsid w:val="79B97740"/>
     <w:multiLevelType w:val="multilevel"/>
     <w:tmpl w:val="79FE615A"/>
@@ -17625,69 +17475,72 @@
     </w:lvl>
   </w:abstractNum>
   <w:num w:numId="1" w16cid:durableId="5256487">
-    <w:abstractNumId w:val="18"/>
+    <w:abstractNumId w:val="19"/>
   </w:num>
   <w:num w:numId="2" w16cid:durableId="386690448">
-    <w:abstractNumId w:val="16"/>
+    <w:abstractNumId w:val="17"/>
   </w:num>
   <w:num w:numId="3" w16cid:durableId="453063656">
     <w:abstractNumId w:val="4"/>
   </w:num>
   <w:num w:numId="4" w16cid:durableId="951130149">
-    <w:abstractNumId w:val="7"/>
+    <w:abstractNumId w:val="8"/>
   </w:num>
   <w:num w:numId="5" w16cid:durableId="2095860841">
-    <w:abstractNumId w:val="21"/>
+    <w:abstractNumId w:val="22"/>
   </w:num>
   <w:num w:numId="6" w16cid:durableId="2088384665">
     <w:abstractNumId w:val="0"/>
   </w:num>
   <w:num w:numId="7" w16cid:durableId="1427726384">
+    <w:abstractNumId w:val="10"/>
+  </w:num>
+  <w:num w:numId="8" w16cid:durableId="510919638">
     <w:abstractNumId w:val="9"/>
   </w:num>
-  <w:num w:numId="8" w16cid:durableId="510919638">
-    <w:abstractNumId w:val="8"/>
-  </w:num>
   <w:num w:numId="9" w16cid:durableId="1382246944">
-    <w:abstractNumId w:val="6"/>
+    <w:abstractNumId w:val="7"/>
   </w:num>
   <w:num w:numId="10" w16cid:durableId="1737898447">
-    <w:abstractNumId w:val="20"/>
+    <w:abstractNumId w:val="21"/>
   </w:num>
   <w:num w:numId="11" w16cid:durableId="762527606">
-    <w:abstractNumId w:val="15"/>
+    <w:abstractNumId w:val="16"/>
   </w:num>
   <w:num w:numId="12" w16cid:durableId="1596667863">
-    <w:abstractNumId w:val="17"/>
+    <w:abstractNumId w:val="18"/>
   </w:num>
   <w:num w:numId="13" w16cid:durableId="1353914412">
     <w:abstractNumId w:val="3"/>
   </w:num>
   <w:num w:numId="14" w16cid:durableId="1823620852">
-    <w:abstractNumId w:val="13"/>
+    <w:abstractNumId w:val="14"/>
   </w:num>
   <w:num w:numId="15" w16cid:durableId="506404354">
-    <w:abstractNumId w:val="19"/>
+    <w:abstractNumId w:val="20"/>
   </w:num>
   <w:num w:numId="16" w16cid:durableId="343285565">
     <w:abstractNumId w:val="2"/>
   </w:num>
   <w:num w:numId="17" w16cid:durableId="256057982">
-    <w:abstractNumId w:val="10"/>
+    <w:abstractNumId w:val="11"/>
   </w:num>
   <w:num w:numId="18" w16cid:durableId="521283474">
     <w:abstractNumId w:val="1"/>
   </w:num>
   <w:num w:numId="19" w16cid:durableId="1904873984">
+    <w:abstractNumId w:val="13"/>
+  </w:num>
+  <w:num w:numId="20" w16cid:durableId="594048033">
     <w:abstractNumId w:val="12"/>
   </w:num>
-  <w:num w:numId="20" w16cid:durableId="594048033">
-    <w:abstractNumId w:val="11"/>
-  </w:num>
   <w:num w:numId="21" w16cid:durableId="1911890921">
-    <w:abstractNumId w:val="14"/>
+    <w:abstractNumId w:val="15"/>
   </w:num>
   <w:num w:numId="22" w16cid:durableId="1996453743">
+    <w:abstractNumId w:val="6"/>
+  </w:num>
+  <w:num w:numId="23" w16cid:durableId="542063660">
     <w:abstractNumId w:val="5"/>
   </w:num>
 </w:numbering>
@@ -18156,6 +18009,7 @@
   <w:style w:type="character" w:default="1" w:styleId="DefaultParagraphFont">
     <w:name w:val="Default Paragraph Font"/>
     <w:uiPriority w:val="1"/>
+    <w:semiHidden/>
     <w:unhideWhenUsed/>
   </w:style>
   <w:style w:type="table" w:default="1" w:styleId="TableNormal">

</xml_diff>